<commit_message>
Compiler auf xlc mit lokaler cc.cfg umstellen
Auf dem Testsystem verweist xlclang.cfg auf CBC.SCLCCMP, das nicht
existiert; CLCDRVR liegt in keiner Bibliothek. CCNDRVR liegt in
CBC.SCCNCMP, xlc.cfg hat aber steplib = NONE. Deshalb: make cfg
erzeugt cc.cfg mit steplib = CBC.SCCNCMP, uebersetzt wird mit
CFG=-F./cc.cfg (Pfad direkt angehaengt). JCL, README und
Dokumentation entsprechend angepasst.

Co-Authored-By: Claude Fable 5.1 <noreply@anthropic.com>
</commit_message>
<xml_diff>
--- a/USSDEMO-Dokumentation.docx
+++ b/USSDEMO-Dokumentation.docx
@@ -40,7 +40,7 @@
         <w:rPr>
           <w:color w:val="555555"/>
         </w:rPr>
-        <w:t xml:space="preserve">Programmdokumentation · Stand 22.09.2026</w:t>
+        <w:t xml:space="preserve">Programmdokumentation · Stand 25.09.2026</w:t>
       </w:r>
     </w:p>
     <w:sdt>
@@ -551,17 +551,6 @@
           <w:sz w:val="20"/>
           <w:szCs w:val="20"/>
         </w:rPr>
-        <w:t xml:space="preserve">xlclang</w:t>
-      </w:r>
-      <w:r>
-        <w:t xml:space="preserve"> oder </w:t>
-      </w:r>
-      <w:r>
-        <w:rPr>
-          <w:rFonts w:ascii="Consolas" w:cs="Consolas" w:eastAsia="Consolas" w:hAnsi="Consolas"/>
-          <w:sz w:val="20"/>
-          <w:szCs w:val="20"/>
-        </w:rPr>
         <w:t xml:space="preserve">xlc</w:t>
       </w:r>
       <w:r>
@@ -4147,7 +4136,7 @@
           </w:tcPr>
           <w:p>
             <w:r>
-              <w:t xml:space="preserve">z/OS, xlclang (Voreinstellung)</w:t>
+              <w:t xml:space="preserve">z/OS, xlc (Voreinstellung)</w:t>
             </w:r>
           </w:p>
         </w:tc>
@@ -4177,7 +4166,18 @@
                 <w:sz w:val="20"/>
                 <w:szCs w:val="20"/>
               </w:rPr>
-              <w:t xml:space="preserve">make</w:t>
+              <w:t xml:space="preserve">make cfg</w:t>
+            </w:r>
+            <w:r>
+              <w:t xml:space="preserve"> und </w:t>
+            </w:r>
+            <w:r>
+              <w:rPr>
+                <w:rFonts w:ascii="Consolas" w:cs="Consolas" w:eastAsia="Consolas" w:hAnsi="Consolas"/>
+                <w:sz w:val="20"/>
+                <w:szCs w:val="20"/>
+              </w:rPr>
+              <w:t xml:space="preserve">make CFG=-F./cc.cfg</w:t>
             </w:r>
             <w:r>
               <w:t xml:space="preserve"/>
@@ -4207,7 +4207,7 @@
           </w:tcPr>
           <w:p>
             <w:r>
-              <w:t xml:space="preserve">z/OS, xlc</w:t>
+              <w:t xml:space="preserve">z/OS, xlclang (falls installiert)</w:t>
             </w:r>
           </w:p>
         </w:tc>
@@ -4237,7 +4237,7 @@
                 <w:sz w:val="20"/>
                 <w:szCs w:val="20"/>
               </w:rPr>
-              <w:t xml:space="preserve">make CC=xlc CFLAGS="-O2 -qlanglvl=extc99"</w:t>
+              <w:t xml:space="preserve">make CC=xlclang CFLAGS="-q64 -O2"</w:t>
             </w:r>
             <w:r>
               <w:t xml:space="preserve"/>
@@ -4384,32 +4384,169 @@
           <w:sz w:val="20"/>
           <w:szCs w:val="20"/>
         </w:rPr>
+        <w:t xml:space="preserve">xlc</w:t>
+      </w:r>
+      <w:r>
+        <w:t xml:space="preserve"> mit </w:t>
+      </w:r>
+      <w:r>
+        <w:rPr>
+          <w:rFonts w:ascii="Consolas" w:cs="Consolas" w:eastAsia="Consolas" w:hAnsi="Consolas"/>
+          <w:sz w:val="20"/>
+          <w:szCs w:val="20"/>
+        </w:rPr>
+        <w:t xml:space="preserve">-O2 -qlanglvl=extc99</w:t>
+      </w:r>
+      <w:r>
+        <w:t xml:space="preserve">; die Option macht unter anderem </w:t>
+      </w:r>
+      <w:r>
+        <w:rPr>
+          <w:rFonts w:ascii="Consolas" w:cs="Consolas" w:eastAsia="Consolas" w:hAnsi="Consolas"/>
+          <w:sz w:val="20"/>
+          <w:szCs w:val="20"/>
+        </w:rPr>
+        <w:t xml:space="preserve">snprintf()</w:t>
+      </w:r>
+      <w:r>
+        <w:t xml:space="preserve"> sichtbar. </w:t>
+      </w:r>
+      <w:r>
+        <w:rPr>
+          <w:rFonts w:ascii="Consolas" w:cs="Consolas" w:eastAsia="Consolas" w:hAnsi="Consolas"/>
+          <w:sz w:val="20"/>
+          <w:szCs w:val="20"/>
+        </w:rPr>
         <w:t xml:space="preserve">xlclang</w:t>
       </w:r>
       <w:r>
-        <w:t xml:space="preserve"> aus z/OS XL C/C++ V2.4.1 mit vollem Pfad </w:t>
-      </w:r>
-      <w:r>
-        <w:rPr>
-          <w:rFonts w:ascii="Consolas" w:cs="Consolas" w:eastAsia="Consolas" w:hAnsi="Consolas"/>
-          <w:sz w:val="20"/>
-          <w:szCs w:val="20"/>
-        </w:rPr>
-        <w:t xml:space="preserve">/usr/lpp/cbclib/xlclang/bin/xlclang</w:t>
-      </w:r>
-      <w:r>
-        <w:t xml:space="preserve"> und den Optionen </w:t>
-      </w:r>
-      <w:r>
-        <w:rPr>
-          <w:rFonts w:ascii="Consolas" w:cs="Consolas" w:eastAsia="Consolas" w:hAnsi="Consolas"/>
-          <w:sz w:val="20"/>
-          <w:szCs w:val="20"/>
-        </w:rPr>
-        <w:t xml:space="preserve">-q64 -O2</w:t>
-      </w:r>
-      <w:r>
-        <w:t xml:space="preserve">. </w:t>
+        <w:t xml:space="preserve"> aus derselben Compiler-Version erzeugt nur 64-Bit-Code (</w:t>
+      </w:r>
+      <w:r>
+        <w:rPr>
+          <w:rFonts w:ascii="Consolas" w:cs="Consolas" w:eastAsia="Consolas" w:hAnsi="Consolas"/>
+          <w:sz w:val="20"/>
+          <w:szCs w:val="20"/>
+        </w:rPr>
+        <w:t xml:space="preserve">-q64</w:t>
+      </w:r>
+      <w:r>
+        <w:t xml:space="preserve">) und setzt voraus, dass seine MVS-Module (</w:t>
+      </w:r>
+      <w:r>
+        <w:rPr>
+          <w:rFonts w:ascii="Consolas" w:cs="Consolas" w:eastAsia="Consolas" w:hAnsi="Consolas"/>
+          <w:sz w:val="20"/>
+          <w:szCs w:val="20"/>
+        </w:rPr>
+        <w:t xml:space="preserve">CLCDRVR</w:t>
+      </w:r>
+      <w:r>
+        <w:t xml:space="preserve">) installiert sind, siehe 7.2. Eine eigene Thread-Bibliothek (</w:t>
+      </w:r>
+      <w:r>
+        <w:rPr>
+          <w:rFonts w:ascii="Consolas" w:cs="Consolas" w:eastAsia="Consolas" w:hAnsi="Consolas"/>
+          <w:sz w:val="20"/>
+          <w:szCs w:val="20"/>
+        </w:rPr>
+        <w:t xml:space="preserve">-lpthread</w:t>
+      </w:r>
+      <w:r>
+        <w:t xml:space="preserve">) braucht z/OS nicht. Das Makefile enthält bewusst keine Tabulatorzeichen: Das Kommando steht mit </w:t>
+      </w:r>
+      <w:r>
+        <w:rPr>
+          <w:rFonts w:ascii="Consolas" w:cs="Consolas" w:eastAsia="Consolas" w:hAnsi="Consolas"/>
+          <w:sz w:val="20"/>
+          <w:szCs w:val="20"/>
+        </w:rPr>
+        <w:t xml:space="preserve">;</w:t>
+      </w:r>
+      <w:r>
+        <w:t xml:space="preserve"> in derselben Zeile wie die Regel, zum Beispiel </w:t>
+      </w:r>
+      <w:r>
+        <w:rPr>
+          <w:rFonts w:ascii="Consolas" w:cs="Consolas" w:eastAsia="Consolas" w:hAnsi="Consolas"/>
+          <w:sz w:val="20"/>
+          <w:szCs w:val="20"/>
+        </w:rPr>
+        <w:t xml:space="preserve">clean: ; rm -f $(PROG) *.o</w:t>
+      </w:r>
+      <w:r>
+        <w:t xml:space="preserve">.</w:t>
+      </w:r>
+    </w:p>
+    <w:p>
+      <w:pPr>
+        <w:pStyle w:val="Heading2"/>
+      </w:pPr>
+      <w:r>
+        <w:t xml:space="preserve">7.2 Compiler-Bibliothek nicht in LNKLST</w:t>
+      </w:r>
+    </w:p>
+    <w:p>
+      <w:pPr>
+        <w:spacing w:after="120"/>
+      </w:pPr>
+      <w:r>
+        <w:t xml:space="preserve">Der Compiler-Treiber </w:t>
+      </w:r>
+      <w:r>
+        <w:rPr>
+          <w:rFonts w:ascii="Consolas" w:cs="Consolas" w:eastAsia="Consolas" w:hAnsi="Consolas"/>
+          <w:sz w:val="20"/>
+          <w:szCs w:val="20"/>
+        </w:rPr>
+        <w:t xml:space="preserve">/usr/lpp/cbclib/xlc/exe/ccndrvr</w:t>
+      </w:r>
+      <w:r>
+        <w:t xml:space="preserve"> ist kein Programm, sondern ein externer Link auf das MVS-Modul </w:t>
+      </w:r>
+      <w:r>
+        <w:rPr>
+          <w:rFonts w:ascii="Consolas" w:cs="Consolas" w:eastAsia="Consolas" w:hAnsi="Consolas"/>
+          <w:sz w:val="20"/>
+          <w:szCs w:val="20"/>
+        </w:rPr>
+        <w:t xml:space="preserve">CCNDRVR</w:t>
+      </w:r>
+      <w:r>
+        <w:t xml:space="preserve"> in </w:t>
+      </w:r>
+      <w:r>
+        <w:rPr>
+          <w:rFonts w:ascii="Consolas" w:cs="Consolas" w:eastAsia="Consolas" w:hAnsi="Consolas"/>
+          <w:sz w:val="20"/>
+          <w:szCs w:val="20"/>
+        </w:rPr>
+        <w:t xml:space="preserve">CBC.SCCNCMP</w:t>
+      </w:r>
+      <w:r>
+        <w:t xml:space="preserve">. Findet z/OS dieses Modul nicht in STEPLIB, LNKLST oder LPA, bricht die Übersetzung ab: bei </w:t>
+      </w:r>
+      <w:r>
+        <w:rPr>
+          <w:rFonts w:ascii="Consolas" w:cs="Consolas" w:eastAsia="Consolas" w:hAnsi="Consolas"/>
+          <w:sz w:val="20"/>
+          <w:szCs w:val="20"/>
+        </w:rPr>
+        <w:t xml:space="preserve">xlc</w:t>
+      </w:r>
+      <w:r>
+        <w:t xml:space="preserve"> mit </w:t>
+      </w:r>
+      <w:r>
+        <w:rPr>
+          <w:rFonts w:ascii="Consolas" w:cs="Consolas" w:eastAsia="Consolas" w:hAnsi="Consolas"/>
+          <w:sz w:val="20"/>
+          <w:szCs w:val="20"/>
+        </w:rPr>
+        <w:t xml:space="preserve">FSUM3221 Cannot spawn program …/ccndrvr</w:t>
+      </w:r>
+      <w:r>
+        <w:t xml:space="preserve">, bei </w:t>
       </w:r>
       <w:r>
         <w:rPr>
@@ -4420,18 +4557,284 @@
         <w:t xml:space="preserve">xlclang</w:t>
       </w:r>
       <w:r>
-        <w:t xml:space="preserve"> erzeugt nur 64-Bit-Code, deshalb </w:t>
-      </w:r>
-      <w:r>
-        <w:rPr>
-          <w:rFonts w:ascii="Consolas" w:cs="Consolas" w:eastAsia="Consolas" w:hAnsi="Consolas"/>
-          <w:sz w:val="20"/>
-          <w:szCs w:val="20"/>
-        </w:rPr>
-        <w:t xml:space="preserve">-q64</w:t>
-      </w:r>
-      <w:r>
-        <w:t xml:space="preserve">. Für </w:t>
+        <w:t xml:space="preserve"> (Modul </w:t>
+      </w:r>
+      <w:r>
+        <w:rPr>
+          <w:rFonts w:ascii="Consolas" w:cs="Consolas" w:eastAsia="Consolas" w:hAnsi="Consolas"/>
+          <w:sz w:val="20"/>
+          <w:szCs w:val="20"/>
+        </w:rPr>
+        <w:t xml:space="preserve">CLCDRVR</w:t>
+      </w:r>
+      <w:r>
+        <w:t xml:space="preserve">) mit </w:t>
+      </w:r>
+      <w:r>
+        <w:rPr>
+          <w:rFonts w:ascii="Consolas" w:cs="Consolas" w:eastAsia="Consolas" w:hAnsi="Consolas"/>
+          <w:sz w:val="20"/>
+          <w:szCs w:val="20"/>
+        </w:rPr>
+        <w:t xml:space="preserve">FSUM3224 … clcdrvr: signal 9 received</w:t>
+      </w:r>
+      <w:r>
+        <w:t xml:space="preserve">. Im SYSLOG steht dann ein Abend </w:t>
+      </w:r>
+      <w:r>
+        <w:rPr>
+          <w:rFonts w:ascii="Consolas" w:cs="Consolas" w:eastAsia="Consolas" w:hAnsi="Consolas"/>
+          <w:sz w:val="20"/>
+          <w:szCs w:val="20"/>
+        </w:rPr>
+        <w:t xml:space="preserve">EC6</w:t>
+      </w:r>
+      <w:r>
+        <w:t xml:space="preserve"> mit Reason Code </w:t>
+      </w:r>
+      <w:r>
+        <w:rPr>
+          <w:rFonts w:ascii="Consolas" w:cs="Consolas" w:eastAsia="Consolas" w:hAnsi="Consolas"/>
+          <w:sz w:val="20"/>
+          <w:szCs w:val="20"/>
+        </w:rPr>
+        <w:t xml:space="preserve">….C032</w:t>
+      </w:r>
+      <w:r>
+        <w:t xml:space="preserve"> und </w:t>
+      </w:r>
+      <w:r>
+        <w:rPr>
+          <w:rFonts w:ascii="Consolas" w:cs="Consolas" w:eastAsia="Consolas" w:hAnsi="Consolas"/>
+          <w:sz w:val="20"/>
+          <w:szCs w:val="20"/>
+        </w:rPr>
+        <w:t xml:space="preserve">BPXP018I</w:t>
+      </w:r>
+      <w:r>
+        <w:t xml:space="preserve">; die letzten vier Stellen </w:t>
+      </w:r>
+      <w:r>
+        <w:rPr>
+          <w:rFonts w:ascii="Consolas" w:cs="Consolas" w:eastAsia="Consolas" w:hAnsi="Consolas"/>
+          <w:sz w:val="20"/>
+          <w:szCs w:val="20"/>
+        </w:rPr>
+        <w:t xml:space="preserve">C032</w:t>
+      </w:r>
+      <w:r>
+        <w:t xml:space="preserve"> bedeuten, dass ein Sticky-Programm nicht im MVS-Suchpfad gefunden wurde. Register 5 im Symptom-Dump enthält den Modulnamen in EBCDIC.</w:t>
+      </w:r>
+    </w:p>
+    <w:p>
+      <w:pPr>
+        <w:spacing w:after="120"/>
+      </w:pPr>
+      <w:r>
+        <w:t xml:space="preserve">Die Shell-Variable </w:t>
+      </w:r>
+      <w:r>
+        <w:rPr>
+          <w:rFonts w:ascii="Consolas" w:cs="Consolas" w:eastAsia="Consolas" w:hAnsi="Consolas"/>
+          <w:sz w:val="20"/>
+          <w:szCs w:val="20"/>
+        </w:rPr>
+        <w:t xml:space="preserve">STEPLIB</w:t>
+      </w:r>
+      <w:r>
+        <w:t xml:space="preserve"> hilft nicht. Der Compiler liest die Bibliothek ausschließlich aus dem Attribut </w:t>
+      </w:r>
+      <w:r>
+        <w:rPr>
+          <w:rFonts w:ascii="Consolas" w:cs="Consolas" w:eastAsia="Consolas" w:hAnsi="Consolas"/>
+          <w:sz w:val="20"/>
+          <w:szCs w:val="20"/>
+        </w:rPr>
+        <w:t xml:space="preserve">steplib</w:t>
+      </w:r>
+      <w:r>
+        <w:t xml:space="preserve"> seiner Konfigurationsdatei. In der gelieferten </w:t>
+      </w:r>
+      <w:r>
+        <w:rPr>
+          <w:rFonts w:ascii="Consolas" w:cs="Consolas" w:eastAsia="Consolas" w:hAnsi="Consolas"/>
+          <w:sz w:val="20"/>
+          <w:szCs w:val="20"/>
+        </w:rPr>
+        <w:t xml:space="preserve">xlc.cfg</w:t>
+      </w:r>
+      <w:r>
+        <w:t xml:space="preserve"> steht dort </w:t>
+      </w:r>
+      <w:r>
+        <w:rPr>
+          <w:rFonts w:ascii="Consolas" w:cs="Consolas" w:eastAsia="Consolas" w:hAnsi="Consolas"/>
+          <w:sz w:val="20"/>
+          <w:szCs w:val="20"/>
+        </w:rPr>
+        <w:t xml:space="preserve">NONE</w:t>
+      </w:r>
+      <w:r>
+        <w:t xml:space="preserve">:</w:t>
+      </w:r>
+    </w:p>
+    <w:p>
+      <w:pPr>
+        <w:pStyle w:val="Code"/>
+        <w:shd w:fill="F3F3F1" w:color="auto" w:val="clear"/>
+      </w:pPr>
+      <w:r>
+        <w:rPr>
+          <w:rFonts w:ascii="Consolas" w:cs="Consolas" w:eastAsia="Consolas" w:hAnsi="Consolas"/>
+          <w:sz w:val="17"/>
+          <w:szCs w:val="17"/>
+        </w:rPr>
+        <w:t xml:space="preserve">grep -n steplib /usr/lpp/cbclib/xlc/etc/xlc.cfg</w:t>
+      </w:r>
+    </w:p>
+    <w:p>
+      <w:pPr>
+        <w:spacing w:after="160"/>
+      </w:pPr>
+    </w:p>
+    <w:p>
+      <w:pPr>
+        <w:spacing w:after="120"/>
+      </w:pPr>
+      <w:r>
+        <w:t xml:space="preserve"/>
+      </w:r>
+      <w:r>
+        <w:rPr>
+          <w:rFonts w:ascii="Consolas" w:cs="Consolas" w:eastAsia="Consolas" w:hAnsi="Consolas"/>
+          <w:sz w:val="20"/>
+          <w:szCs w:val="20"/>
+        </w:rPr>
+        <w:t xml:space="preserve">make cfg</w:t>
+      </w:r>
+      <w:r>
+        <w:t xml:space="preserve"> kopiert die Datei deshalb nach </w:t>
+      </w:r>
+      <w:r>
+        <w:rPr>
+          <w:rFonts w:ascii="Consolas" w:cs="Consolas" w:eastAsia="Consolas" w:hAnsi="Consolas"/>
+          <w:sz w:val="20"/>
+          <w:szCs w:val="20"/>
+        </w:rPr>
+        <w:t xml:space="preserve">cc.cfg</w:t>
+      </w:r>
+      <w:r>
+        <w:t xml:space="preserve"> und trägt </w:t>
+      </w:r>
+      <w:r>
+        <w:rPr>
+          <w:rFonts w:ascii="Consolas" w:cs="Consolas" w:eastAsia="Consolas" w:hAnsi="Consolas"/>
+          <w:sz w:val="20"/>
+          <w:szCs w:val="20"/>
+        </w:rPr>
+        <w:t xml:space="preserve">steplib = CBC.SCCNCMP</w:t>
+      </w:r>
+      <w:r>
+        <w:t xml:space="preserve"> ein. Übersetzt wird dann mit </w:t>
+      </w:r>
+      <w:r>
+        <w:rPr>
+          <w:rFonts w:ascii="Consolas" w:cs="Consolas" w:eastAsia="Consolas" w:hAnsi="Consolas"/>
+          <w:sz w:val="20"/>
+          <w:szCs w:val="20"/>
+        </w:rPr>
+        <w:t xml:space="preserve">make CFG=-F./cc.cfg</w:t>
+      </w:r>
+      <w:r>
+        <w:t xml:space="preserve">; die Option </w:t>
+      </w:r>
+      <w:r>
+        <w:rPr>
+          <w:rFonts w:ascii="Consolas" w:cs="Consolas" w:eastAsia="Consolas" w:hAnsi="Consolas"/>
+          <w:sz w:val="20"/>
+          <w:szCs w:val="20"/>
+        </w:rPr>
+        <w:t xml:space="preserve">-F</w:t>
+      </w:r>
+      <w:r>
+        <w:t xml:space="preserve"> erwartet den Pfad direkt angehängt, ohne Leerzeichen. Heißt die Bibliothek anders, lautet der Aufruf </w:t>
+      </w:r>
+      <w:r>
+        <w:rPr>
+          <w:rFonts w:ascii="Consolas" w:cs="Consolas" w:eastAsia="Consolas" w:hAnsi="Consolas"/>
+          <w:sz w:val="20"/>
+          <w:szCs w:val="20"/>
+        </w:rPr>
+        <w:t xml:space="preserve">make cfg CMPLIB=IHR.NAME</w:t>
+      </w:r>
+      <w:r>
+        <w:t xml:space="preserve">. Welche Bibliotheken es gibt, zeigt </w:t>
+      </w:r>
+      <w:r>
+        <w:rPr>
+          <w:rFonts w:ascii="Consolas" w:cs="Consolas" w:eastAsia="Consolas" w:hAnsi="Consolas"/>
+          <w:sz w:val="20"/>
+          <w:szCs w:val="20"/>
+        </w:rPr>
+        <w:t xml:space="preserve">tso "LISTCAT LEVEL(CBC)"</w:t>
+      </w:r>
+      <w:r>
+        <w:t xml:space="preserve">, ob ein Modul enthalten ist </w:t>
+      </w:r>
+      <w:r>
+        <w:rPr>
+          <w:rFonts w:ascii="Consolas" w:cs="Consolas" w:eastAsia="Consolas" w:hAnsi="Consolas"/>
+          <w:sz w:val="20"/>
+          <w:szCs w:val="20"/>
+        </w:rPr>
+        <w:t xml:space="preserve">tso "LISTDS 'CBC.SCCNCMP' MEMBERS" | grep DRVR</w:t>
+      </w:r>
+      <w:r>
+        <w:t xml:space="preserve">. Auf dem Testsystem verwies die gelieferte </w:t>
+      </w:r>
+      <w:r>
+        <w:rPr>
+          <w:rFonts w:ascii="Consolas" w:cs="Consolas" w:eastAsia="Consolas" w:hAnsi="Consolas"/>
+          <w:sz w:val="20"/>
+          <w:szCs w:val="20"/>
+        </w:rPr>
+        <w:t xml:space="preserve">xlclang.cfg</w:t>
+      </w:r>
+      <w:r>
+        <w:t xml:space="preserve"> auf </w:t>
+      </w:r>
+      <w:r>
+        <w:rPr>
+          <w:rFonts w:ascii="Consolas" w:cs="Consolas" w:eastAsia="Consolas" w:hAnsi="Consolas"/>
+          <w:sz w:val="20"/>
+          <w:szCs w:val="20"/>
+        </w:rPr>
+        <w:t xml:space="preserve">CBC.SCLCCMP</w:t>
+      </w:r>
+      <w:r>
+        <w:t xml:space="preserve">, das nicht existiert, und </w:t>
+      </w:r>
+      <w:r>
+        <w:rPr>
+          <w:rFonts w:ascii="Consolas" w:cs="Consolas" w:eastAsia="Consolas" w:hAnsi="Consolas"/>
+          <w:sz w:val="20"/>
+          <w:szCs w:val="20"/>
+        </w:rPr>
+        <w:t xml:space="preserve">CLCDRVR</w:t>
+      </w:r>
+      <w:r>
+        <w:t xml:space="preserve"> lag in keiner Bibliothek; </w:t>
+      </w:r>
+      <w:r>
+        <w:rPr>
+          <w:rFonts w:ascii="Consolas" w:cs="Consolas" w:eastAsia="Consolas" w:hAnsi="Consolas"/>
+          <w:sz w:val="20"/>
+          <w:szCs w:val="20"/>
+        </w:rPr>
+        <w:t xml:space="preserve">xlclang</w:t>
+      </w:r>
+      <w:r>
+        <w:t xml:space="preserve"> war dort also nicht nutzbar, </w:t>
       </w:r>
       <w:r>
         <w:rPr>
@@ -4442,59 +4845,53 @@
         <w:t xml:space="preserve">xlc</w:t>
       </w:r>
       <w:r>
-        <w:t xml:space="preserve"> ist zusätzlich </w:t>
-      </w:r>
-      <w:r>
-        <w:rPr>
-          <w:rFonts w:ascii="Consolas" w:cs="Consolas" w:eastAsia="Consolas" w:hAnsi="Consolas"/>
-          <w:sz w:val="20"/>
-          <w:szCs w:val="20"/>
-        </w:rPr>
-        <w:t xml:space="preserve">-qlanglvl=extc99</w:t>
-      </w:r>
-      <w:r>
-        <w:t xml:space="preserve"> nötig, das unter anderem </w:t>
-      </w:r>
-      <w:r>
-        <w:rPr>
-          <w:rFonts w:ascii="Consolas" w:cs="Consolas" w:eastAsia="Consolas" w:hAnsi="Consolas"/>
-          <w:sz w:val="20"/>
-          <w:szCs w:val="20"/>
-        </w:rPr>
-        <w:t xml:space="preserve">snprintf()</w:t>
-      </w:r>
-      <w:r>
-        <w:t xml:space="preserve"> sichtbar macht. Eine eigene Thread-Bibliothek (</w:t>
-      </w:r>
-      <w:r>
-        <w:rPr>
-          <w:rFonts w:ascii="Consolas" w:cs="Consolas" w:eastAsia="Consolas" w:hAnsi="Consolas"/>
-          <w:sz w:val="20"/>
-          <w:szCs w:val="20"/>
-        </w:rPr>
-        <w:t xml:space="preserve">-lpthread</w:t>
-      </w:r>
-      <w:r>
-        <w:t xml:space="preserve">) braucht z/OS nicht. Das Makefile enthält bewusst keine Tabulatorzeichen: Das Kommando steht mit </w:t>
-      </w:r>
-      <w:r>
-        <w:rPr>
-          <w:rFonts w:ascii="Consolas" w:cs="Consolas" w:eastAsia="Consolas" w:hAnsi="Consolas"/>
-          <w:sz w:val="20"/>
-          <w:szCs w:val="20"/>
-        </w:rPr>
-        <w:t xml:space="preserve">;</w:t>
-      </w:r>
-      <w:r>
-        <w:t xml:space="preserve"> in derselben Zeile wie die Regel, zum Beispiel </w:t>
-      </w:r>
-      <w:r>
-        <w:rPr>
-          <w:rFonts w:ascii="Consolas" w:cs="Consolas" w:eastAsia="Consolas" w:hAnsi="Consolas"/>
-          <w:sz w:val="20"/>
-          <w:szCs w:val="20"/>
-        </w:rPr>
-        <w:t xml:space="preserve">clean: ; rm -f $(PROG) *.o</w:t>
+        <w:t xml:space="preserve"> mit </w:t>
+      </w:r>
+      <w:r>
+        <w:rPr>
+          <w:rFonts w:ascii="Consolas" w:cs="Consolas" w:eastAsia="Consolas" w:hAnsi="Consolas"/>
+          <w:sz w:val="20"/>
+          <w:szCs w:val="20"/>
+        </w:rPr>
+        <w:t xml:space="preserve">cc.cfg</w:t>
+      </w:r>
+      <w:r>
+        <w:t xml:space="preserve"> schon.</w:t>
+      </w:r>
+    </w:p>
+    <w:p>
+      <w:pPr>
+        <w:pStyle w:val="Heading2"/>
+      </w:pPr>
+      <w:r>
+        <w:t xml:space="preserve">7.3 Übertragung nach z/OS</w:t>
+      </w:r>
+    </w:p>
+    <w:p>
+      <w:pPr>
+        <w:spacing w:after="120"/>
+      </w:pPr>
+      <w:r>
+        <w:t xml:space="preserve">Beim Weg über den ISPF-Editor, über FB80-Datasets oder über manche Dateitransfers werden Tabulatoren in Leerzeichen umgewandelt und Zeilen ab Spalte 73 abgeschnitten. Ein Makefile mit Tab-Rezeptzeilen bricht dann mit </w:t>
+      </w:r>
+      <w:r>
+        <w:rPr>
+          <w:rFonts w:ascii="Consolas" w:cs="Consolas" w:eastAsia="Consolas" w:hAnsi="Consolas"/>
+          <w:sz w:val="20"/>
+          <w:szCs w:val="20"/>
+        </w:rPr>
+        <w:t xml:space="preserve">FSUM8232 Expecting macro or rule defn</w:t>
+      </w:r>
+      <w:r>
+        <w:t xml:space="preserve"> ab. In C-Quelltext verliert eine abgeschnittene Kommentarzeile ihr schließendes </w:t>
+      </w:r>
+      <w:r>
+        <w:rPr>
+          <w:rFonts w:ascii="Consolas" w:cs="Consolas" w:eastAsia="Consolas" w:hAnsi="Consolas"/>
+          <w:sz w:val="20"/>
+          <w:szCs w:val="20"/>
+        </w:rPr>
+        <w:t xml:space="preserve">*/</w:t>
       </w:r>
       <w:r>
         <w:t xml:space="preserve">.</w:t>
@@ -4502,10 +4899,40 @@
     </w:p>
     <w:p>
       <w:pPr>
+        <w:spacing w:after="120"/>
+      </w:pPr>
+      <w:r>
+        <w:t xml:space="preserve">Alle drei Dateien sind deshalb tab-frei, und keine Zeile ist länger als 71 Zeichen. Übertragen Sie die Dateien als Text mit der Codepage IBM-1047. Bei einer deutschen Codepage wie IBM-273 oder IBM-1141 kommen eckige und geschweifte Klammern, </w:t>
+      </w:r>
+      <w:r>
+        <w:rPr>
+          <w:rFonts w:ascii="Consolas" w:cs="Consolas" w:eastAsia="Consolas" w:hAnsi="Consolas"/>
+          <w:sz w:val="20"/>
+          <w:szCs w:val="20"/>
+        </w:rPr>
+        <w:t xml:space="preserve">#</w:t>
+      </w:r>
+      <w:r>
+        <w:t xml:space="preserve">, </w:t>
+      </w:r>
+      <w:r>
+        <w:rPr>
+          <w:rFonts w:ascii="Consolas" w:cs="Consolas" w:eastAsia="Consolas" w:hAnsi="Consolas"/>
+          <w:sz w:val="20"/>
+          <w:szCs w:val="20"/>
+        </w:rPr>
+        <w:t xml:space="preserve">|</w:t>
+      </w:r>
+      <w:r>
+        <w:t xml:space="preserve"> und der Backslash falsch an, und der Compiler meldet Syntaxfehler.</w:t>
+      </w:r>
+    </w:p>
+    <w:p>
+      <w:pPr>
         <w:pStyle w:val="Heading2"/>
       </w:pPr>
       <w:r>
-        <w:t xml:space="preserve">7.2 Compiler-Bibliothek nicht in LNKLST</w:t>
+        <w:t xml:space="preserve">7.4 Als Batch-Job</w:t>
       </w:r>
     </w:p>
     <w:p>
@@ -4513,136 +4940,40 @@
         <w:spacing w:after="120"/>
       </w:pPr>
       <w:r>
-        <w:t xml:space="preserve">Der Compiler-Treiber </w:t>
-      </w:r>
-      <w:r>
-        <w:rPr>
-          <w:rFonts w:ascii="Consolas" w:cs="Consolas" w:eastAsia="Consolas" w:hAnsi="Consolas"/>
-          <w:sz w:val="20"/>
-          <w:szCs w:val="20"/>
-        </w:rPr>
-        <w:t xml:space="preserve">/usr/lpp/cbclib/xlclang/exe/clcdrvr</w:t>
-      </w:r>
-      <w:r>
-        <w:t xml:space="preserve"> ist kein Programm, sondern ein externer Link auf das MVS-Modul </w:t>
-      </w:r>
-      <w:r>
-        <w:rPr>
-          <w:rFonts w:ascii="Consolas" w:cs="Consolas" w:eastAsia="Consolas" w:hAnsi="Consolas"/>
-          <w:sz w:val="20"/>
-          <w:szCs w:val="20"/>
-        </w:rPr>
-        <w:t xml:space="preserve">CLCDRVR</w:t>
-      </w:r>
-      <w:r>
-        <w:t xml:space="preserve">. Findet z/OS dieses Modul nicht in STEPLIB, LNKLST oder LPA, bricht die Übersetzung ab. Bei </w:t>
-      </w:r>
-      <w:r>
-        <w:rPr>
-          <w:rFonts w:ascii="Consolas" w:cs="Consolas" w:eastAsia="Consolas" w:hAnsi="Consolas"/>
-          <w:sz w:val="20"/>
-          <w:szCs w:val="20"/>
-        </w:rPr>
-        <w:t xml:space="preserve">xlc</w:t>
-      </w:r>
-      <w:r>
-        <w:t xml:space="preserve"> lautet die Meldung </w:t>
-      </w:r>
-      <w:r>
-        <w:rPr>
-          <w:rFonts w:ascii="Consolas" w:cs="Consolas" w:eastAsia="Consolas" w:hAnsi="Consolas"/>
-          <w:sz w:val="20"/>
-          <w:szCs w:val="20"/>
-        </w:rPr>
-        <w:t xml:space="preserve">FSUM3221 Cannot spawn program …/ccndrvr</w:t>
-      </w:r>
-      <w:r>
-        <w:t xml:space="preserve">, bei </w:t>
-      </w:r>
-      <w:r>
-        <w:rPr>
-          <w:rFonts w:ascii="Consolas" w:cs="Consolas" w:eastAsia="Consolas" w:hAnsi="Consolas"/>
-          <w:sz w:val="20"/>
-          <w:szCs w:val="20"/>
-        </w:rPr>
-        <w:t xml:space="preserve">xlclang</w:t>
-      </w:r>
-      <w:r>
-        <w:t xml:space="preserve"> </w:t>
-      </w:r>
-      <w:r>
-        <w:rPr>
-          <w:rFonts w:ascii="Consolas" w:cs="Consolas" w:eastAsia="Consolas" w:hAnsi="Consolas"/>
-          <w:sz w:val="20"/>
-          <w:szCs w:val="20"/>
-        </w:rPr>
-        <w:t xml:space="preserve">FSUM3224 … clcdrvr: signal 9 received</w:t>
-      </w:r>
-      <w:r>
-        <w:t xml:space="preserve">. Im SYSLOG steht dann ein Abend </w:t>
-      </w:r>
-      <w:r>
-        <w:rPr>
-          <w:rFonts w:ascii="Consolas" w:cs="Consolas" w:eastAsia="Consolas" w:hAnsi="Consolas"/>
-          <w:sz w:val="20"/>
-          <w:szCs w:val="20"/>
-        </w:rPr>
-        <w:t xml:space="preserve">EC6</w:t>
-      </w:r>
-      <w:r>
-        <w:t xml:space="preserve"> mit Reason Code </w:t>
-      </w:r>
-      <w:r>
-        <w:rPr>
-          <w:rFonts w:ascii="Consolas" w:cs="Consolas" w:eastAsia="Consolas" w:hAnsi="Consolas"/>
-          <w:sz w:val="20"/>
-          <w:szCs w:val="20"/>
-        </w:rPr>
-        <w:t xml:space="preserve">….C032</w:t>
-      </w:r>
-      <w:r>
-        <w:t xml:space="preserve"> und </w:t>
-      </w:r>
-      <w:r>
-        <w:rPr>
-          <w:rFonts w:ascii="Consolas" w:cs="Consolas" w:eastAsia="Consolas" w:hAnsi="Consolas"/>
-          <w:sz w:val="20"/>
-          <w:szCs w:val="20"/>
-        </w:rPr>
-        <w:t xml:space="preserve">BPXP018I</w:t>
-      </w:r>
-      <w:r>
-        <w:t xml:space="preserve">; die letzten vier Stellen </w:t>
-      </w:r>
-      <w:r>
-        <w:rPr>
-          <w:rFonts w:ascii="Consolas" w:cs="Consolas" w:eastAsia="Consolas" w:hAnsi="Consolas"/>
-          <w:sz w:val="20"/>
-          <w:szCs w:val="20"/>
-        </w:rPr>
-        <w:t xml:space="preserve">C032</w:t>
-      </w:r>
-      <w:r>
-        <w:t xml:space="preserve"> bedeuten, dass ein Sticky-Programm nicht im MVS-Suchpfad gefunden wurde. Register 5 im Symptom-Dump enthält den Modulnamen in EBCDIC.</w:t>
-      </w:r>
-    </w:p>
-    <w:p>
-      <w:pPr>
-        <w:spacing w:after="120"/>
-      </w:pPr>
-      <w:r>
-        <w:t xml:space="preserve">Die Shell-Variable </w:t>
-      </w:r>
-      <w:r>
-        <w:rPr>
-          <w:rFonts w:ascii="Consolas" w:cs="Consolas" w:eastAsia="Consolas" w:hAnsi="Consolas"/>
-          <w:sz w:val="20"/>
-          <w:szCs w:val="20"/>
-        </w:rPr>
-        <w:t xml:space="preserve">STEPLIB</w:t>
-      </w:r>
-      <w:r>
-        <w:t xml:space="preserve"> hilft nicht. Der Compiler liest die Bibliothek ausschließlich aus dem Attribut </w:t>
+        <w:t xml:space="preserve"/>
+      </w:r>
+      <w:r>
+        <w:rPr>
+          <w:rFonts w:ascii="Consolas" w:cs="Consolas" w:eastAsia="Consolas" w:hAnsi="Consolas"/>
+          <w:sz w:val="20"/>
+          <w:szCs w:val="20"/>
+        </w:rPr>
+        <w:t xml:space="preserve">USSDEMO.jcl</w:t>
+      </w:r>
+      <w:r>
+        <w:t xml:space="preserve"> enthält zwei BPXBATCH-Steps. </w:t>
+      </w:r>
+      <w:r>
+        <w:rPr>
+          <w:rFonts w:ascii="Consolas" w:cs="Consolas" w:eastAsia="Consolas" w:hAnsi="Consolas"/>
+          <w:sz w:val="20"/>
+          <w:szCs w:val="20"/>
+        </w:rPr>
+        <w:t xml:space="preserve">COMPILE</w:t>
+      </w:r>
+      <w:r>
+        <w:t xml:space="preserve"> wechselt in das Quellverzeichnis, erzeugt mit </w:t>
+      </w:r>
+      <w:r>
+        <w:rPr>
+          <w:rFonts w:ascii="Consolas" w:cs="Consolas" w:eastAsia="Consolas" w:hAnsi="Consolas"/>
+          <w:sz w:val="20"/>
+          <w:szCs w:val="20"/>
+        </w:rPr>
+        <w:t xml:space="preserve">make cfg</w:t>
+      </w:r>
+      <w:r>
+        <w:t xml:space="preserve"> die lokale Compiler-Konfiguration, zeigt deren </w:t>
       </w:r>
       <w:r>
         <w:rPr>
@@ -4653,305 +4984,7 @@
         <w:t xml:space="preserve">steplib</w:t>
       </w:r>
       <w:r>
-        <w:t xml:space="preserve"> seiner Konfigurationsdatei. Prüfen Sie zuerst, was dort steht:</w:t>
-      </w:r>
-    </w:p>
-    <w:p>
-      <w:pPr>
-        <w:pStyle w:val="Code"/>
-        <w:shd w:fill="F3F3F1" w:color="auto" w:val="clear"/>
-      </w:pPr>
-      <w:r>
-        <w:rPr>
-          <w:rFonts w:ascii="Consolas" w:cs="Consolas" w:eastAsia="Consolas" w:hAnsi="Consolas"/>
-          <w:sz w:val="17"/>
-          <w:szCs w:val="17"/>
-        </w:rPr>
-        <w:t xml:space="preserve">grep -n steplib /usr/lpp/cbclib/xlclang/etc/xlclang.cfg</w:t>
-      </w:r>
-    </w:p>
-    <w:p>
-      <w:pPr>
-        <w:spacing w:after="160"/>
-      </w:pPr>
-    </w:p>
-    <w:p>
-      <w:pPr>
-        <w:spacing w:after="120"/>
-      </w:pPr>
-      <w:r>
-        <w:t xml:space="preserve">Steht dort eine Bibliothek, die das Modul </w:t>
-      </w:r>
-      <w:r>
-        <w:rPr>
-          <w:rFonts w:ascii="Consolas" w:cs="Consolas" w:eastAsia="Consolas" w:hAnsi="Consolas"/>
-          <w:sz w:val="20"/>
-          <w:szCs w:val="20"/>
-        </w:rPr>
-        <w:t xml:space="preserve">CLCDRVR</w:t>
-      </w:r>
-      <w:r>
-        <w:t xml:space="preserve"> enthält, ist nichts zu tun. Steht dort </w:t>
-      </w:r>
-      <w:r>
-        <w:rPr>
-          <w:rFonts w:ascii="Consolas" w:cs="Consolas" w:eastAsia="Consolas" w:hAnsi="Consolas"/>
-          <w:sz w:val="20"/>
-          <w:szCs w:val="20"/>
-        </w:rPr>
-        <w:t xml:space="preserve">NONE</w:t>
-      </w:r>
-      <w:r>
-        <w:t xml:space="preserve"> oder eine falsche Bibliothek, erzeugt </w:t>
-      </w:r>
-      <w:r>
-        <w:rPr>
-          <w:rFonts w:ascii="Consolas" w:cs="Consolas" w:eastAsia="Consolas" w:hAnsi="Consolas"/>
-          <w:sz w:val="20"/>
-          <w:szCs w:val="20"/>
-        </w:rPr>
-        <w:t xml:space="preserve">make cfg CMPLIB=…</w:t>
-      </w:r>
-      <w:r>
-        <w:t xml:space="preserve"> eine lokale Kopie </w:t>
-      </w:r>
-      <w:r>
-        <w:rPr>
-          <w:rFonts w:ascii="Consolas" w:cs="Consolas" w:eastAsia="Consolas" w:hAnsi="Consolas"/>
-          <w:sz w:val="20"/>
-          <w:szCs w:val="20"/>
-        </w:rPr>
-        <w:t xml:space="preserve">cc.cfg</w:t>
-      </w:r>
-      <w:r>
-        <w:t xml:space="preserve"> mit dem richtigen Namen, und übersetzt wird mit </w:t>
-      </w:r>
-      <w:r>
-        <w:rPr>
-          <w:rFonts w:ascii="Consolas" w:cs="Consolas" w:eastAsia="Consolas" w:hAnsi="Consolas"/>
-          <w:sz w:val="20"/>
-          <w:szCs w:val="20"/>
-        </w:rPr>
-        <w:t xml:space="preserve">make CFG=-F./cc.cfg</w:t>
-      </w:r>
-      <w:r>
-        <w:t xml:space="preserve">. Die Option </w:t>
-      </w:r>
-      <w:r>
-        <w:rPr>
-          <w:rFonts w:ascii="Consolas" w:cs="Consolas" w:eastAsia="Consolas" w:hAnsi="Consolas"/>
-          <w:sz w:val="20"/>
-          <w:szCs w:val="20"/>
-        </w:rPr>
-        <w:t xml:space="preserve">-F</w:t>
-      </w:r>
-      <w:r>
-        <w:t xml:space="preserve"> erwartet den Pfad direkt angehängt, ohne Leerzeichen. Welche Bibliotheken es gibt, zeigt </w:t>
-      </w:r>
-      <w:r>
-        <w:rPr>
-          <w:rFonts w:ascii="Consolas" w:cs="Consolas" w:eastAsia="Consolas" w:hAnsi="Consolas"/>
-          <w:sz w:val="20"/>
-          <w:szCs w:val="20"/>
-        </w:rPr>
-        <w:t xml:space="preserve">tso "LISTCAT LEVEL(CBC)"</w:t>
-      </w:r>
-      <w:r>
-        <w:t xml:space="preserve">; typische Namen sind </w:t>
-      </w:r>
-      <w:r>
-        <w:rPr>
-          <w:rFonts w:ascii="Consolas" w:cs="Consolas" w:eastAsia="Consolas" w:hAnsi="Consolas"/>
-          <w:sz w:val="20"/>
-          <w:szCs w:val="20"/>
-        </w:rPr>
-        <w:t xml:space="preserve">CBC.SCLCCMP</w:t>
-      </w:r>
-      <w:r>
-        <w:t xml:space="preserve"> für </w:t>
-      </w:r>
-      <w:r>
-        <w:rPr>
-          <w:rFonts w:ascii="Consolas" w:cs="Consolas" w:eastAsia="Consolas" w:hAnsi="Consolas"/>
-          <w:sz w:val="20"/>
-          <w:szCs w:val="20"/>
-        </w:rPr>
-        <w:t xml:space="preserve">xlclang</w:t>
-      </w:r>
-      <w:r>
-        <w:t xml:space="preserve"> und </w:t>
-      </w:r>
-      <w:r>
-        <w:rPr>
-          <w:rFonts w:ascii="Consolas" w:cs="Consolas" w:eastAsia="Consolas" w:hAnsi="Consolas"/>
-          <w:sz w:val="20"/>
-          <w:szCs w:val="20"/>
-        </w:rPr>
-        <w:t xml:space="preserve">CBC.SCCNCMP</w:t>
-      </w:r>
-      <w:r>
-        <w:t xml:space="preserve"> für </w:t>
-      </w:r>
-      <w:r>
-        <w:rPr>
-          <w:rFonts w:ascii="Consolas" w:cs="Consolas" w:eastAsia="Consolas" w:hAnsi="Consolas"/>
-          <w:sz w:val="20"/>
-          <w:szCs w:val="20"/>
-        </w:rPr>
-        <w:t xml:space="preserve">xlc</w:t>
-      </w:r>
-      <w:r>
-        <w:t xml:space="preserve">. Ob ein Modul enthalten ist, zeigt </w:t>
-      </w:r>
-      <w:r>
-        <w:rPr>
-          <w:rFonts w:ascii="Consolas" w:cs="Consolas" w:eastAsia="Consolas" w:hAnsi="Consolas"/>
-          <w:sz w:val="20"/>
-          <w:szCs w:val="20"/>
-        </w:rPr>
-        <w:t xml:space="preserve">tso "LISTDS 'CBC.SCLCCMP' MEMBERS"</w:t>
-      </w:r>
-      <w:r>
-        <w:t xml:space="preserve">. Für </w:t>
-      </w:r>
-      <w:r>
-        <w:rPr>
-          <w:rFonts w:ascii="Consolas" w:cs="Consolas" w:eastAsia="Consolas" w:hAnsi="Consolas"/>
-          <w:sz w:val="20"/>
-          <w:szCs w:val="20"/>
-        </w:rPr>
-        <w:t xml:space="preserve">xlc</w:t>
-      </w:r>
-      <w:r>
-        <w:t xml:space="preserve"> kommt beim </w:t>
-      </w:r>
-      <w:r>
-        <w:rPr>
-          <w:rFonts w:ascii="Consolas" w:cs="Consolas" w:eastAsia="Consolas" w:hAnsi="Consolas"/>
-          <w:sz w:val="20"/>
-          <w:szCs w:val="20"/>
-        </w:rPr>
-        <w:t xml:space="preserve">make cfg</w:t>
-      </w:r>
-      <w:r>
-        <w:t xml:space="preserve"> zusätzlich </w:t>
-      </w:r>
-      <w:r>
-        <w:rPr>
-          <w:rFonts w:ascii="Consolas" w:cs="Consolas" w:eastAsia="Consolas" w:hAnsi="Consolas"/>
-          <w:sz w:val="20"/>
-          <w:szCs w:val="20"/>
-        </w:rPr>
-        <w:t xml:space="preserve">CCCFG=/usr/lpp/cbclib/xlc/etc/xlc.cfg</w:t>
-      </w:r>
-      <w:r>
-        <w:t xml:space="preserve"> dazu.</w:t>
-      </w:r>
-    </w:p>
-    <w:p>
-      <w:pPr>
-        <w:pStyle w:val="Heading2"/>
-      </w:pPr>
-      <w:r>
-        <w:t xml:space="preserve">7.3 Übertragung nach z/OS</w:t>
-      </w:r>
-    </w:p>
-    <w:p>
-      <w:pPr>
-        <w:spacing w:after="120"/>
-      </w:pPr>
-      <w:r>
-        <w:t xml:space="preserve">Beim Weg über den ISPF-Editor, über FB80-Datasets oder über manche Dateitransfers werden Tabulatoren in Leerzeichen umgewandelt und Zeilen ab Spalte 73 abgeschnitten. Ein Makefile mit Tab-Rezeptzeilen bricht dann mit </w:t>
-      </w:r>
-      <w:r>
-        <w:rPr>
-          <w:rFonts w:ascii="Consolas" w:cs="Consolas" w:eastAsia="Consolas" w:hAnsi="Consolas"/>
-          <w:sz w:val="20"/>
-          <w:szCs w:val="20"/>
-        </w:rPr>
-        <w:t xml:space="preserve">FSUM8232 Expecting macro or rule defn</w:t>
-      </w:r>
-      <w:r>
-        <w:t xml:space="preserve"> ab. In C-Quelltext verliert eine abgeschnittene Kommentarzeile ihr schließendes </w:t>
-      </w:r>
-      <w:r>
-        <w:rPr>
-          <w:rFonts w:ascii="Consolas" w:cs="Consolas" w:eastAsia="Consolas" w:hAnsi="Consolas"/>
-          <w:sz w:val="20"/>
-          <w:szCs w:val="20"/>
-        </w:rPr>
-        <w:t xml:space="preserve">*/</w:t>
-      </w:r>
-      <w:r>
-        <w:t xml:space="preserve">.</w:t>
-      </w:r>
-    </w:p>
-    <w:p>
-      <w:pPr>
-        <w:spacing w:after="120"/>
-      </w:pPr>
-      <w:r>
-        <w:t xml:space="preserve">Alle drei Dateien sind deshalb tab-frei, und keine Zeile ist länger als 71 Zeichen. Übertragen Sie die Dateien als Text mit der Codepage IBM-1047. Bei einer deutschen Codepage wie IBM-273 oder IBM-1141 kommen eckige und geschweifte Klammern, </w:t>
-      </w:r>
-      <w:r>
-        <w:rPr>
-          <w:rFonts w:ascii="Consolas" w:cs="Consolas" w:eastAsia="Consolas" w:hAnsi="Consolas"/>
-          <w:sz w:val="20"/>
-          <w:szCs w:val="20"/>
-        </w:rPr>
-        <w:t xml:space="preserve">#</w:t>
-      </w:r>
-      <w:r>
-        <w:t xml:space="preserve">, </w:t>
-      </w:r>
-      <w:r>
-        <w:rPr>
-          <w:rFonts w:ascii="Consolas" w:cs="Consolas" w:eastAsia="Consolas" w:hAnsi="Consolas"/>
-          <w:sz w:val="20"/>
-          <w:szCs w:val="20"/>
-        </w:rPr>
-        <w:t xml:space="preserve">|</w:t>
-      </w:r>
-      <w:r>
-        <w:t xml:space="preserve"> und der Backslash falsch an, und der Compiler meldet Syntaxfehler.</w:t>
-      </w:r>
-    </w:p>
-    <w:p>
-      <w:pPr>
-        <w:pStyle w:val="Heading2"/>
-      </w:pPr>
-      <w:r>
-        <w:t xml:space="preserve">7.4 Als Batch-Job</w:t>
-      </w:r>
-    </w:p>
-    <w:p>
-      <w:pPr>
-        <w:spacing w:after="120"/>
-      </w:pPr>
-      <w:r>
-        <w:t xml:space="preserve"/>
-      </w:r>
-      <w:r>
-        <w:rPr>
-          <w:rFonts w:ascii="Consolas" w:cs="Consolas" w:eastAsia="Consolas" w:hAnsi="Consolas"/>
-          <w:sz w:val="20"/>
-          <w:szCs w:val="20"/>
-        </w:rPr>
-        <w:t xml:space="preserve">USSDEMO.jcl</w:t>
-      </w:r>
-      <w:r>
-        <w:t xml:space="preserve"> enthält zwei BPXBATCH-Steps. </w:t>
-      </w:r>
-      <w:r>
-        <w:rPr>
-          <w:rFonts w:ascii="Consolas" w:cs="Consolas" w:eastAsia="Consolas" w:hAnsi="Consolas"/>
-          <w:sz w:val="20"/>
-          <w:szCs w:val="20"/>
-        </w:rPr>
-        <w:t xml:space="preserve">COMPILE</w:t>
-      </w:r>
-      <w:r>
-        <w:t xml:space="preserve"> wechselt in das Quellverzeichnis, zeigt mit </w:t>
+        <w:t xml:space="preserve">-Zeile per </w:t>
       </w:r>
       <w:r>
         <w:rPr>
@@ -4962,40 +4995,18 @@
         <w:t xml:space="preserve">grep</w:t>
       </w:r>
       <w:r>
-        <w:t xml:space="preserve"> die </w:t>
-      </w:r>
-      <w:r>
-        <w:rPr>
-          <w:rFonts w:ascii="Consolas" w:cs="Consolas" w:eastAsia="Consolas" w:hAnsi="Consolas"/>
-          <w:sz w:val="20"/>
-          <w:szCs w:val="20"/>
-        </w:rPr>
-        <w:t xml:space="preserve">steplib</w:t>
-      </w:r>
-      <w:r>
-        <w:t xml:space="preserve">-Zeile der Compiler-Konfiguration im Job-Output an und ruft dann </w:t>
-      </w:r>
-      <w:r>
-        <w:rPr>
-          <w:rFonts w:ascii="Consolas" w:cs="Consolas" w:eastAsia="Consolas" w:hAnsi="Consolas"/>
-          <w:sz w:val="20"/>
-          <w:szCs w:val="20"/>
-        </w:rPr>
-        <w:t xml:space="preserve">make clean all</w:t>
-      </w:r>
-      <w:r>
-        <w:t xml:space="preserve"> auf. Muss eine eigene </w:t>
-      </w:r>
-      <w:r>
-        <w:rPr>
-          <w:rFonts w:ascii="Consolas" w:cs="Consolas" w:eastAsia="Consolas" w:hAnsi="Consolas"/>
-          <w:sz w:val="20"/>
-          <w:szCs w:val="20"/>
-        </w:rPr>
-        <w:t xml:space="preserve">cc.cfg</w:t>
-      </w:r>
-      <w:r>
-        <w:t xml:space="preserve"> verwendet werden, ersetzen Sie die beiden Zeilen wie im JCL-Kommentar beschrieben. </w:t>
+        <w:t xml:space="preserve"> im Job-Output an und ruft dann </w:t>
+      </w:r>
+      <w:r>
+        <w:rPr>
+          <w:rFonts w:ascii="Consolas" w:cs="Consolas" w:eastAsia="Consolas" w:hAnsi="Consolas"/>
+          <w:sz w:val="20"/>
+          <w:szCs w:val="20"/>
+        </w:rPr>
+        <w:t xml:space="preserve">make clean all CFG=-F./cc.cfg</w:t>
+      </w:r>
+      <w:r>
+        <w:t xml:space="preserve"> auf. </w:t>
       </w:r>
       <w:r>
         <w:rPr>
@@ -5297,7 +5308,7 @@
           <w:sz w:val="20"/>
           <w:szCs w:val="20"/>
         </w:rPr>
-        <w:t xml:space="preserve">xlclang</w:t>
+        <w:t xml:space="preserve">xlc</w:t>
       </w:r>
       <w:r>
         <w:t xml:space="preserve"> hängen Sie </w:t>
@@ -6216,21 +6227,21 @@
           <w:sz w:val="17"/>
           <w:szCs w:val="17"/>
         </w:rPr>
-        <w:t xml:space="preserve"> *     xlclang -q64 -o ussdemo ussdemo.c   (XL C/C++ V2.4.1)</w:t>
-      </w:r>
-    </w:p>
-    <w:p>
-      <w:pPr>
-        <w:pStyle w:val="Code"/>
-        <w:shd w:fill="F3F3F1" w:color="auto" w:val="clear"/>
-      </w:pPr>
-      <w:r>
-        <w:rPr>
-          <w:rFonts w:ascii="Consolas" w:cs="Consolas" w:eastAsia="Consolas" w:hAnsi="Consolas"/>
-          <w:sz w:val="17"/>
-          <w:szCs w:val="17"/>
-        </w:rPr>
-        <w:t xml:space="preserve"> *     xlc -qlanglvl=extc99 -o ussdemo ussdemo.c</w:t>
+        <w:t xml:space="preserve"> *     xlc -F./cc.cfg -qlanglvl=extc99 -o ussdemo ussdemo.c</w:t>
+      </w:r>
+    </w:p>
+    <w:p>
+      <w:pPr>
+        <w:pStyle w:val="Code"/>
+        <w:shd w:fill="F3F3F1" w:color="auto" w:val="clear"/>
+      </w:pPr>
+      <w:r>
+        <w:rPr>
+          <w:rFonts w:ascii="Consolas" w:cs="Consolas" w:eastAsia="Consolas" w:hAnsi="Consolas"/>
+          <w:sz w:val="17"/>
+          <w:szCs w:val="17"/>
+        </w:rPr>
+        <w:t xml:space="preserve"> *     xlclang -q64 -o ussdemo ussdemo.c   (falls installiert)</w:t>
       </w:r>
     </w:p>
     <w:p>
@@ -11936,7 +11947,7 @@
           <w:sz w:val="17"/>
           <w:szCs w:val="17"/>
         </w:rPr>
-        <w:t xml:space="preserve"># Voreinstellung: xlclang (z/OS XL C/C++ V2.4.1, nur 64 Bit -&gt; -q64)</w:t>
+        <w:t xml:space="preserve"># Voreinstellung: xlc (z/OS XL C/C++) mit lokaler Konfiguration cc.cfg</w:t>
       </w:r>
     </w:p>
     <w:p>
@@ -11964,21 +11975,35 @@
           <w:sz w:val="17"/>
           <w:szCs w:val="17"/>
         </w:rPr>
-        <w:t xml:space="preserve">#   z/OS, xlclang:   make</w:t>
-      </w:r>
-    </w:p>
-    <w:p>
-      <w:pPr>
-        <w:pStyle w:val="Code"/>
-        <w:shd w:fill="F3F3F1" w:color="auto" w:val="clear"/>
-      </w:pPr>
-      <w:r>
-        <w:rPr>
-          <w:rFonts w:ascii="Consolas" w:cs="Consolas" w:eastAsia="Consolas" w:hAnsi="Consolas"/>
-          <w:sz w:val="17"/>
-          <w:szCs w:val="17"/>
-        </w:rPr>
-        <w:t xml:space="preserve">#   z/OS, xlc:       make CC=xlc CFLAGS="-O2 -qlanglvl=extc99"</w:t>
+        <w:t xml:space="preserve">#   z/OS, xlc:       make cfg &amp;&amp; make CFG=-F./cc.cfg</w:t>
+      </w:r>
+    </w:p>
+    <w:p>
+      <w:pPr>
+        <w:pStyle w:val="Code"/>
+        <w:shd w:fill="F3F3F1" w:color="auto" w:val="clear"/>
+      </w:pPr>
+      <w:r>
+        <w:rPr>
+          <w:rFonts w:ascii="Consolas" w:cs="Consolas" w:eastAsia="Consolas" w:hAnsi="Consolas"/>
+          <w:sz w:val="17"/>
+          <w:szCs w:val="17"/>
+        </w:rPr>
+        <w:t xml:space="preserve">#   z/OS, xlclang:   make CC=xlclang CFLAGS="-q64 -O2"</w:t>
+      </w:r>
+    </w:p>
+    <w:p>
+      <w:pPr>
+        <w:pStyle w:val="Code"/>
+        <w:shd w:fill="F3F3F1" w:color="auto" w:val="clear"/>
+      </w:pPr>
+      <w:r>
+        <w:rPr>
+          <w:rFonts w:ascii="Consolas" w:cs="Consolas" w:eastAsia="Consolas" w:hAnsi="Consolas"/>
+          <w:sz w:val="17"/>
+          <w:szCs w:val="17"/>
+        </w:rPr>
+        <w:t xml:space="preserve">#                    (nur wenn CLCDRVR in einer Bibliothek liegt)</w:t>
       </w:r>
     </w:p>
     <w:p>
@@ -12034,77 +12059,91 @@
           <w:sz w:val="17"/>
           <w:szCs w:val="17"/>
         </w:rPr>
-        <w:t xml:space="preserve"># Compiler-Bibliothek (STEPLIB): Der Treiber (clcdrvr bzw. ccndrvr)</w:t>
-      </w:r>
-    </w:p>
-    <w:p>
-      <w:pPr>
-        <w:pStyle w:val="Code"/>
-        <w:shd w:fill="F3F3F1" w:color="auto" w:val="clear"/>
-      </w:pPr>
-      <w:r>
-        <w:rPr>
-          <w:rFonts w:ascii="Consolas" w:cs="Consolas" w:eastAsia="Consolas" w:hAnsi="Consolas"/>
-          <w:sz w:val="17"/>
-          <w:szCs w:val="17"/>
-        </w:rPr>
-        <w:t xml:space="preserve"># ist nur ein externer Link auf ein MVS-Modul. Wird das Modul nicht</w:t>
-      </w:r>
-    </w:p>
-    <w:p>
-      <w:pPr>
-        <w:pStyle w:val="Code"/>
-        <w:shd w:fill="F3F3F1" w:color="auto" w:val="clear"/>
-      </w:pPr>
-      <w:r>
-        <w:rPr>
-          <w:rFonts w:ascii="Consolas" w:cs="Consolas" w:eastAsia="Consolas" w:hAnsi="Consolas"/>
-          <w:sz w:val="17"/>
-          <w:szCs w:val="17"/>
-        </w:rPr>
-        <w:t xml:space="preserve"># gefunden, endet der Compiler mit FSUM3221 (xlc) oder mit FSUM3224,</w:t>
-      </w:r>
-    </w:p>
-    <w:p>
-      <w:pPr>
-        <w:pStyle w:val="Code"/>
-        <w:shd w:fill="F3F3F1" w:color="auto" w:val="clear"/>
-      </w:pPr>
-      <w:r>
-        <w:rPr>
-          <w:rFonts w:ascii="Consolas" w:cs="Consolas" w:eastAsia="Consolas" w:hAnsi="Consolas"/>
-          <w:sz w:val="17"/>
-          <w:szCs w:val="17"/>
-        </w:rPr>
-        <w:t xml:space="preserve"># Signal 9 und Abend EC6 Reason ....C032 (xlclang). Die Shell-Variable</w:t>
-      </w:r>
-    </w:p>
-    <w:p>
-      <w:pPr>
-        <w:pStyle w:val="Code"/>
-        <w:shd w:fill="F3F3F1" w:color="auto" w:val="clear"/>
-      </w:pPr>
-      <w:r>
-        <w:rPr>
-          <w:rFonts w:ascii="Consolas" w:cs="Consolas" w:eastAsia="Consolas" w:hAnsi="Consolas"/>
-          <w:sz w:val="17"/>
-          <w:szCs w:val="17"/>
-        </w:rPr>
-        <w:t xml:space="preserve"># STEPLIB hilft nicht; der Wert kommt nur aus dem Attribut "steplib"</w:t>
-      </w:r>
-    </w:p>
-    <w:p>
-      <w:pPr>
-        <w:pStyle w:val="Code"/>
-        <w:shd w:fill="F3F3F1" w:color="auto" w:val="clear"/>
-      </w:pPr>
-      <w:r>
-        <w:rPr>
-          <w:rFonts w:ascii="Consolas" w:cs="Consolas" w:eastAsia="Consolas" w:hAnsi="Consolas"/>
-          <w:sz w:val="17"/>
-          <w:szCs w:val="17"/>
-        </w:rPr>
-        <w:t xml:space="preserve"># der Compiler-Konfiguration. Erst pruefen, was dort steht:</w:t>
+        <w:t xml:space="preserve"># Compiler-Bibliothek (STEPLIB): Der Treiber (ccndrvr bzw. clcdrvr)</w:t>
+      </w:r>
+    </w:p>
+    <w:p>
+      <w:pPr>
+        <w:pStyle w:val="Code"/>
+        <w:shd w:fill="F3F3F1" w:color="auto" w:val="clear"/>
+      </w:pPr>
+      <w:r>
+        <w:rPr>
+          <w:rFonts w:ascii="Consolas" w:cs="Consolas" w:eastAsia="Consolas" w:hAnsi="Consolas"/>
+          <w:sz w:val="17"/>
+          <w:szCs w:val="17"/>
+        </w:rPr>
+        <w:t xml:space="preserve"># ist nur ein externer Link auf ein MVS-Modul (CCNDRVR bzw. CLCDRVR).</w:t>
+      </w:r>
+    </w:p>
+    <w:p>
+      <w:pPr>
+        <w:pStyle w:val="Code"/>
+        <w:shd w:fill="F3F3F1" w:color="auto" w:val="clear"/>
+      </w:pPr>
+      <w:r>
+        <w:rPr>
+          <w:rFonts w:ascii="Consolas" w:cs="Consolas" w:eastAsia="Consolas" w:hAnsi="Consolas"/>
+          <w:sz w:val="17"/>
+          <w:szCs w:val="17"/>
+        </w:rPr>
+        <w:t xml:space="preserve"># Wird das Modul nicht in STEPLIB/LNKLST/LPA gefunden, endet der</w:t>
+      </w:r>
+    </w:p>
+    <w:p>
+      <w:pPr>
+        <w:pStyle w:val="Code"/>
+        <w:shd w:fill="F3F3F1" w:color="auto" w:val="clear"/>
+      </w:pPr>
+      <w:r>
+        <w:rPr>
+          <w:rFonts w:ascii="Consolas" w:cs="Consolas" w:eastAsia="Consolas" w:hAnsi="Consolas"/>
+          <w:sz w:val="17"/>
+          <w:szCs w:val="17"/>
+        </w:rPr>
+        <w:t xml:space="preserve"># Compiler mit FSUM3221 (xlc) oder FSUM3224, Signal 9, Abend EC6</w:t>
+      </w:r>
+    </w:p>
+    <w:p>
+      <w:pPr>
+        <w:pStyle w:val="Code"/>
+        <w:shd w:fill="F3F3F1" w:color="auto" w:val="clear"/>
+      </w:pPr>
+      <w:r>
+        <w:rPr>
+          <w:rFonts w:ascii="Consolas" w:cs="Consolas" w:eastAsia="Consolas" w:hAnsi="Consolas"/>
+          <w:sz w:val="17"/>
+          <w:szCs w:val="17"/>
+        </w:rPr>
+        <w:t xml:space="preserve"># Reason ....C032 (xlclang). Die Shell-Variable STEPLIB hilft nicht;</w:t>
+      </w:r>
+    </w:p>
+    <w:p>
+      <w:pPr>
+        <w:pStyle w:val="Code"/>
+        <w:shd w:fill="F3F3F1" w:color="auto" w:val="clear"/>
+      </w:pPr>
+      <w:r>
+        <w:rPr>
+          <w:rFonts w:ascii="Consolas" w:cs="Consolas" w:eastAsia="Consolas" w:hAnsi="Consolas"/>
+          <w:sz w:val="17"/>
+          <w:szCs w:val="17"/>
+        </w:rPr>
+        <w:t xml:space="preserve"># der Wert kommt nur aus dem Attribut "steplib" der Compiler-</w:t>
+      </w:r>
+    </w:p>
+    <w:p>
+      <w:pPr>
+        <w:pStyle w:val="Code"/>
+        <w:shd w:fill="F3F3F1" w:color="auto" w:val="clear"/>
+      </w:pPr>
+      <w:r>
+        <w:rPr>
+          <w:rFonts w:ascii="Consolas" w:cs="Consolas" w:eastAsia="Consolas" w:hAnsi="Consolas"/>
+          <w:sz w:val="17"/>
+          <w:szCs w:val="17"/>
+        </w:rPr>
+        <w:t xml:space="preserve"># Konfiguration. In der gelieferten xlc.cfg steht dort NONE.</w:t>
       </w:r>
     </w:p>
     <w:p>
@@ -12132,7 +12171,35 @@
           <w:sz w:val="17"/>
           <w:szCs w:val="17"/>
         </w:rPr>
-        <w:t xml:space="preserve">#     grep -n steplib $(CCCFG)</w:t>
+        <w:t xml:space="preserve"># "make cfg" kopiert deshalb $(CCCFG) nach cc.cfg und traegt dort</w:t>
+      </w:r>
+    </w:p>
+    <w:p>
+      <w:pPr>
+        <w:pStyle w:val="Code"/>
+        <w:shd w:fill="F3F3F1" w:color="auto" w:val="clear"/>
+      </w:pPr>
+      <w:r>
+        <w:rPr>
+          <w:rFonts w:ascii="Consolas" w:cs="Consolas" w:eastAsia="Consolas" w:hAnsi="Consolas"/>
+          <w:sz w:val="17"/>
+          <w:szCs w:val="17"/>
+        </w:rPr>
+        <w:t xml:space="preserve"># steplib = $(CMPLIB) ein. Uebersetzt wird dann mit CFG=-F./cc.cfg</w:t>
+      </w:r>
+    </w:p>
+    <w:p>
+      <w:pPr>
+        <w:pStyle w:val="Code"/>
+        <w:shd w:fill="F3F3F1" w:color="auto" w:val="clear"/>
+      </w:pPr>
+      <w:r>
+        <w:rPr>
+          <w:rFonts w:ascii="Consolas" w:cs="Consolas" w:eastAsia="Consolas" w:hAnsi="Consolas"/>
+          <w:sz w:val="17"/>
+          <w:szCs w:val="17"/>
+        </w:rPr>
+        <w:t xml:space="preserve"># (-F mit direkt angehaengtem Pfad, ohne Leerzeichen).</w:t>
       </w:r>
     </w:p>
     <w:p>
@@ -12160,35 +12227,35 @@
           <w:sz w:val="17"/>
           <w:szCs w:val="17"/>
         </w:rPr>
-        <w:t xml:space="preserve"># Steht dort bereits eine Bibliothek, die den Treiber enthaelt, ist</w:t>
-      </w:r>
-    </w:p>
-    <w:p>
-      <w:pPr>
-        <w:pStyle w:val="Code"/>
-        <w:shd w:fill="F3F3F1" w:color="auto" w:val="clear"/>
-      </w:pPr>
-      <w:r>
-        <w:rPr>
-          <w:rFonts w:ascii="Consolas" w:cs="Consolas" w:eastAsia="Consolas" w:hAnsi="Consolas"/>
-          <w:sz w:val="17"/>
-          <w:szCs w:val="17"/>
-        </w:rPr>
-        <w:t xml:space="preserve"># nichts zu tun. Steht dort NONE oder eine falsche Bibliothek, eine</w:t>
-      </w:r>
-    </w:p>
-    <w:p>
-      <w:pPr>
-        <w:pStyle w:val="Code"/>
-        <w:shd w:fill="F3F3F1" w:color="auto" w:val="clear"/>
-      </w:pPr>
-      <w:r>
-        <w:rPr>
-          <w:rFonts w:ascii="Consolas" w:cs="Consolas" w:eastAsia="Consolas" w:hAnsi="Consolas"/>
-          <w:sz w:val="17"/>
-          <w:szCs w:val="17"/>
-        </w:rPr>
-        <w:t xml:space="preserve"># lokale Kopie cc.cfg mit richtiger Bibliothek erzeugen und nutzen:</w:t>
+        <w:t xml:space="preserve"># Bibliothek pruefen:  tso "LISTCAT LEVEL(CBC)"</w:t>
+      </w:r>
+    </w:p>
+    <w:p>
+      <w:pPr>
+        <w:pStyle w:val="Code"/>
+        <w:shd w:fill="F3F3F1" w:color="auto" w:val="clear"/>
+      </w:pPr>
+      <w:r>
+        <w:rPr>
+          <w:rFonts w:ascii="Consolas" w:cs="Consolas" w:eastAsia="Consolas" w:hAnsi="Consolas"/>
+          <w:sz w:val="17"/>
+          <w:szCs w:val="17"/>
+        </w:rPr>
+        <w:t xml:space="preserve">#                      tso "LISTDS 'CBC.SCCNCMP' MEMBERS" | grep DRVR</w:t>
+      </w:r>
+    </w:p>
+    <w:p>
+      <w:pPr>
+        <w:pStyle w:val="Code"/>
+        <w:shd w:fill="F3F3F1" w:color="auto" w:val="clear"/>
+      </w:pPr>
+      <w:r>
+        <w:rPr>
+          <w:rFonts w:ascii="Consolas" w:cs="Consolas" w:eastAsia="Consolas" w:hAnsi="Consolas"/>
+          <w:sz w:val="17"/>
+          <w:szCs w:val="17"/>
+        </w:rPr>
+        <w:t xml:space="preserve"># Anderer Name:        make cfg CMPLIB=IHR.NAME.SCCNCMP</w:t>
       </w:r>
     </w:p>
     <w:p>
@@ -12216,104 +12283,6 @@
           <w:sz w:val="17"/>
           <w:szCs w:val="17"/>
         </w:rPr>
-        <w:t xml:space="preserve">#     make cfg CMPLIB=CBC.SCLCCMP        (Bibliothek ggf. anpassen)</w:t>
-      </w:r>
-    </w:p>
-    <w:p>
-      <w:pPr>
-        <w:pStyle w:val="Code"/>
-        <w:shd w:fill="F3F3F1" w:color="auto" w:val="clear"/>
-      </w:pPr>
-      <w:r>
-        <w:rPr>
-          <w:rFonts w:ascii="Consolas" w:cs="Consolas" w:eastAsia="Consolas" w:hAnsi="Consolas"/>
-          <w:sz w:val="17"/>
-          <w:szCs w:val="17"/>
-        </w:rPr>
-        <w:t xml:space="preserve">#     make CFG=-F./cc.cfg</w:t>
-      </w:r>
-    </w:p>
-    <w:p>
-      <w:pPr>
-        <w:pStyle w:val="Code"/>
-        <w:shd w:fill="F3F3F1" w:color="auto" w:val="clear"/>
-      </w:pPr>
-      <w:r>
-        <w:rPr>
-          <w:rFonts w:ascii="Consolas" w:cs="Consolas" w:eastAsia="Consolas" w:hAnsi="Consolas"/>
-          <w:sz w:val="17"/>
-          <w:szCs w:val="17"/>
-        </w:rPr>
-        <w:t xml:space="preserve">#</w:t>
-      </w:r>
-    </w:p>
-    <w:p>
-      <w:pPr>
-        <w:pStyle w:val="Code"/>
-        <w:shd w:fill="F3F3F1" w:color="auto" w:val="clear"/>
-      </w:pPr>
-      <w:r>
-        <w:rPr>
-          <w:rFonts w:ascii="Consolas" w:cs="Consolas" w:eastAsia="Consolas" w:hAnsi="Consolas"/>
-          <w:sz w:val="17"/>
-          <w:szCs w:val="17"/>
-        </w:rPr>
-        <w:t xml:space="preserve"># Die Bibliothek muss das Modul CLCDRVR (xlclang) bzw. CCNDRVR (xlc)</w:t>
-      </w:r>
-    </w:p>
-    <w:p>
-      <w:pPr>
-        <w:pStyle w:val="Code"/>
-        <w:shd w:fill="F3F3F1" w:color="auto" w:val="clear"/>
-      </w:pPr>
-      <w:r>
-        <w:rPr>
-          <w:rFonts w:ascii="Consolas" w:cs="Consolas" w:eastAsia="Consolas" w:hAnsi="Consolas"/>
-          <w:sz w:val="17"/>
-          <w:szCs w:val="17"/>
-        </w:rPr>
-        <w:t xml:space="preserve"># enthalten. Kandidaten zeigt:  tso "LISTCAT LEVEL(CBC)"</w:t>
-      </w:r>
-    </w:p>
-    <w:p>
-      <w:pPr>
-        <w:pStyle w:val="Code"/>
-        <w:shd w:fill="F3F3F1" w:color="auto" w:val="clear"/>
-      </w:pPr>
-      <w:r>
-        <w:rPr>
-          <w:rFonts w:ascii="Consolas" w:cs="Consolas" w:eastAsia="Consolas" w:hAnsi="Consolas"/>
-          <w:sz w:val="17"/>
-          <w:szCs w:val="17"/>
-        </w:rPr>
-        <w:t xml:space="preserve"># Fuer xlc:  make cfg CCCFG=/usr/lpp/cbclib/xlc/etc/xlc.cfg CMPLIB=...</w:t>
-      </w:r>
-    </w:p>
-    <w:p>
-      <w:pPr>
-        <w:pStyle w:val="Code"/>
-        <w:shd w:fill="F3F3F1" w:color="auto" w:val="clear"/>
-      </w:pPr>
-      <w:r>
-        <w:rPr>
-          <w:rFonts w:ascii="Consolas" w:cs="Consolas" w:eastAsia="Consolas" w:hAnsi="Consolas"/>
-          <w:sz w:val="17"/>
-          <w:szCs w:val="17"/>
-        </w:rPr>
-        <w:t xml:space="preserve">#</w:t>
-      </w:r>
-    </w:p>
-    <w:p>
-      <w:pPr>
-        <w:pStyle w:val="Code"/>
-        <w:shd w:fill="F3F3F1" w:color="auto" w:val="clear"/>
-      </w:pPr>
-      <w:r>
-        <w:rPr>
-          <w:rFonts w:ascii="Consolas" w:cs="Consolas" w:eastAsia="Consolas" w:hAnsi="Consolas"/>
-          <w:sz w:val="17"/>
-          <w:szCs w:val="17"/>
-        </w:rPr>
         <w:t xml:space="preserve"># Hinweis z/OS: Threads brauchen keine eigene Bibliothek (-lpthread</w:t>
       </w:r>
     </w:p>
@@ -12328,48 +12297,48 @@
           <w:sz w:val="17"/>
           <w:szCs w:val="17"/>
         </w:rPr>
-        <w:t xml:space="preserve"># entfaellt).</w:t>
-      </w:r>
-    </w:p>
-    <w:p>
-      <w:pPr>
-        <w:pStyle w:val="Code"/>
-        <w:shd w:fill="F3F3F1" w:color="auto" w:val="clear"/>
-      </w:pPr>
-      <w:r>
-        <w:rPr>
-          <w:rFonts w:ascii="Consolas" w:cs="Consolas" w:eastAsia="Consolas" w:hAnsi="Consolas"/>
-          <w:sz w:val="17"/>
-          <w:szCs w:val="17"/>
-        </w:rPr>
-      </w:r>
-    </w:p>
-    <w:p>
-      <w:pPr>
-        <w:pStyle w:val="Code"/>
-        <w:shd w:fill="F3F3F1" w:color="auto" w:val="clear"/>
-      </w:pPr>
-      <w:r>
-        <w:rPr>
-          <w:rFonts w:ascii="Consolas" w:cs="Consolas" w:eastAsia="Consolas" w:hAnsi="Consolas"/>
-          <w:sz w:val="17"/>
-          <w:szCs w:val="17"/>
-        </w:rPr>
-        <w:t xml:space="preserve">CC      = /usr/lpp/cbclib/xlclang/bin/xlclang</w:t>
-      </w:r>
-    </w:p>
-    <w:p>
-      <w:pPr>
-        <w:pStyle w:val="Code"/>
-        <w:shd w:fill="F3F3F1" w:color="auto" w:val="clear"/>
-      </w:pPr>
-      <w:r>
-        <w:rPr>
-          <w:rFonts w:ascii="Consolas" w:cs="Consolas" w:eastAsia="Consolas" w:hAnsi="Consolas"/>
-          <w:sz w:val="17"/>
-          <w:szCs w:val="17"/>
-        </w:rPr>
-        <w:t xml:space="preserve">CFLAGS  = -q64 -O2</w:t>
+        <w:t xml:space="preserve"># entfaellt); -qlanglvl=extc99 macht u.a. snprintf() sichtbar.</w:t>
+      </w:r>
+    </w:p>
+    <w:p>
+      <w:pPr>
+        <w:pStyle w:val="Code"/>
+        <w:shd w:fill="F3F3F1" w:color="auto" w:val="clear"/>
+      </w:pPr>
+      <w:r>
+        <w:rPr>
+          <w:rFonts w:ascii="Consolas" w:cs="Consolas" w:eastAsia="Consolas" w:hAnsi="Consolas"/>
+          <w:sz w:val="17"/>
+          <w:szCs w:val="17"/>
+        </w:rPr>
+      </w:r>
+    </w:p>
+    <w:p>
+      <w:pPr>
+        <w:pStyle w:val="Code"/>
+        <w:shd w:fill="F3F3F1" w:color="auto" w:val="clear"/>
+      </w:pPr>
+      <w:r>
+        <w:rPr>
+          <w:rFonts w:ascii="Consolas" w:cs="Consolas" w:eastAsia="Consolas" w:hAnsi="Consolas"/>
+          <w:sz w:val="17"/>
+          <w:szCs w:val="17"/>
+        </w:rPr>
+        <w:t xml:space="preserve">CC      = xlc</w:t>
+      </w:r>
+    </w:p>
+    <w:p>
+      <w:pPr>
+        <w:pStyle w:val="Code"/>
+        <w:shd w:fill="F3F3F1" w:color="auto" w:val="clear"/>
+      </w:pPr>
+      <w:r>
+        <w:rPr>
+          <w:rFonts w:ascii="Consolas" w:cs="Consolas" w:eastAsia="Consolas" w:hAnsi="Consolas"/>
+          <w:sz w:val="17"/>
+          <w:szCs w:val="17"/>
+        </w:rPr>
+        <w:t xml:space="preserve">CFLAGS  = -O2 -qlanglvl=extc99</w:t>
       </w:r>
     </w:p>
     <w:p>
@@ -12424,21 +12393,21 @@
           <w:sz w:val="17"/>
           <w:szCs w:val="17"/>
         </w:rPr>
-        <w:t xml:space="preserve">CMPLIB  = CBC.SCLCCMP</w:t>
-      </w:r>
-    </w:p>
-    <w:p>
-      <w:pPr>
-        <w:pStyle w:val="Code"/>
-        <w:shd w:fill="F3F3F1" w:color="auto" w:val="clear"/>
-      </w:pPr>
-      <w:r>
-        <w:rPr>
-          <w:rFonts w:ascii="Consolas" w:cs="Consolas" w:eastAsia="Consolas" w:hAnsi="Consolas"/>
-          <w:sz w:val="17"/>
-          <w:szCs w:val="17"/>
-        </w:rPr>
-        <w:t xml:space="preserve">CCCFG   = /usr/lpp/cbclib/xlclang/etc/xlclang.cfg</w:t>
+        <w:t xml:space="preserve">CMPLIB  = CBC.SCCNCMP</w:t>
+      </w:r>
+    </w:p>
+    <w:p>
+      <w:pPr>
+        <w:pStyle w:val="Code"/>
+        <w:shd w:fill="F3F3F1" w:color="auto" w:val="clear"/>
+      </w:pPr>
+      <w:r>
+        <w:rPr>
+          <w:rFonts w:ascii="Consolas" w:cs="Consolas" w:eastAsia="Consolas" w:hAnsi="Consolas"/>
+          <w:sz w:val="17"/>
+          <w:szCs w:val="17"/>
+        </w:rPr>
+        <w:t xml:space="preserve">CCCFG   = /usr/lpp/cbclib/xlc/etc/xlc.cfg</w:t>
       </w:r>
     </w:p>
     <w:p>
@@ -12893,21 +12862,21 @@
           <w:sz w:val="17"/>
           <w:szCs w:val="17"/>
         </w:rPr>
-        <w:t xml:space="preserve">//*   - COMPILER IST xlclang (SIEHE MAKEFILE). ANDERER COMPILER:      *</w:t>
-      </w:r>
-    </w:p>
-    <w:p>
-      <w:pPr>
-        <w:pStyle w:val="Code"/>
-        <w:shd w:fill="F3F3F1" w:color="auto" w:val="clear"/>
-      </w:pPr>
-      <w:r>
-        <w:rPr>
-          <w:rFonts w:ascii="Consolas" w:cs="Consolas" w:eastAsia="Consolas" w:hAnsi="Consolas"/>
-          <w:sz w:val="17"/>
-          <w:szCs w:val="17"/>
-        </w:rPr>
-        <w:t xml:space="preserve">//*       make clean all CC=xlc CFLAGS="-O2 -qlanglvl=extc99"         *</w:t>
+        <w:t xml:space="preserve">//*   - COMPILER IST xlc MIT LOKALER KONFIGURATION cc.cfg (SIEHE      *</w:t>
+      </w:r>
+    </w:p>
+    <w:p>
+      <w:pPr>
+        <w:pStyle w:val="Code"/>
+        <w:shd w:fill="F3F3F1" w:color="auto" w:val="clear"/>
+      </w:pPr>
+      <w:r>
+        <w:rPr>
+          <w:rFonts w:ascii="Consolas" w:cs="Consolas" w:eastAsia="Consolas" w:hAnsi="Consolas"/>
+          <w:sz w:val="17"/>
+          <w:szCs w:val="17"/>
+        </w:rPr>
+        <w:t xml:space="preserve">//*     MAKEFILE UND UNTEN)                                           *</w:t>
       </w:r>
     </w:p>
     <w:p>
@@ -13075,175 +13044,175 @@
           <w:sz w:val="17"/>
           <w:szCs w:val="17"/>
         </w:rPr>
-        <w:t xml:space="preserve">//* COMPILER-BIBLIOTHEK: DER COMPILER-TREIBER (clcdrvr) IST EIN       *</w:t>
-      </w:r>
-    </w:p>
-    <w:p>
-      <w:pPr>
-        <w:pStyle w:val="Code"/>
-        <w:shd w:fill="F3F3F1" w:color="auto" w:val="clear"/>
-      </w:pPr>
-      <w:r>
-        <w:rPr>
-          <w:rFonts w:ascii="Consolas" w:cs="Consolas" w:eastAsia="Consolas" w:hAnsi="Consolas"/>
-          <w:sz w:val="17"/>
-          <w:szCs w:val="17"/>
-        </w:rPr>
-        <w:t xml:space="preserve">//* EXTERNER LINK AUF DAS MVS-MODUL CLCDRVR. WIRD ES NICHT IN         *</w:t>
-      </w:r>
-    </w:p>
-    <w:p>
-      <w:pPr>
-        <w:pStyle w:val="Code"/>
-        <w:shd w:fill="F3F3F1" w:color="auto" w:val="clear"/>
-      </w:pPr>
-      <w:r>
-        <w:rPr>
-          <w:rFonts w:ascii="Consolas" w:cs="Consolas" w:eastAsia="Consolas" w:hAnsi="Consolas"/>
-          <w:sz w:val="17"/>
-          <w:szCs w:val="17"/>
-        </w:rPr>
-        <w:t xml:space="preserve">//* STEPLIB/LNKLST/LPA GEFUNDEN: FSUM3224, SIGNAL 9, ABEND EC6        *</w:t>
-      </w:r>
-    </w:p>
-    <w:p>
-      <w:pPr>
-        <w:pStyle w:val="Code"/>
-        <w:shd w:fill="F3F3F1" w:color="auto" w:val="clear"/>
-      </w:pPr>
-      <w:r>
-        <w:rPr>
-          <w:rFonts w:ascii="Consolas" w:cs="Consolas" w:eastAsia="Consolas" w:hAnsi="Consolas"/>
-          <w:sz w:val="17"/>
-          <w:szCs w:val="17"/>
-        </w:rPr>
-        <w:t xml:space="preserve">//* REASON ....C032. DIE SHELL-VARIABLE STEPLIB HILFT NICHT, DER      *</w:t>
-      </w:r>
-    </w:p>
-    <w:p>
-      <w:pPr>
-        <w:pStyle w:val="Code"/>
-        <w:shd w:fill="F3F3F1" w:color="auto" w:val="clear"/>
-      </w:pPr>
-      <w:r>
-        <w:rPr>
-          <w:rFonts w:ascii="Consolas" w:cs="Consolas" w:eastAsia="Consolas" w:hAnsi="Consolas"/>
-          <w:sz w:val="17"/>
-          <w:szCs w:val="17"/>
-        </w:rPr>
-        <w:t xml:space="preserve">//* WERT KOMMT NUR AUS DEM ATTRIBUT steplib DER COMPILER-             *</w:t>
-      </w:r>
-    </w:p>
-    <w:p>
-      <w:pPr>
-        <w:pStyle w:val="Code"/>
-        <w:shd w:fill="F3F3F1" w:color="auto" w:val="clear"/>
-      </w:pPr>
-      <w:r>
-        <w:rPr>
-          <w:rFonts w:ascii="Consolas" w:cs="Consolas" w:eastAsia="Consolas" w:hAnsi="Consolas"/>
-          <w:sz w:val="17"/>
-          <w:szCs w:val="17"/>
-        </w:rPr>
-        <w:t xml:space="preserve">//* KONFIGURATION xlclang.cfg. DER STEP COMPILE ZEIGT DIESE ZEILE     *</w:t>
-      </w:r>
-    </w:p>
-    <w:p>
-      <w:pPr>
-        <w:pStyle w:val="Code"/>
-        <w:shd w:fill="F3F3F1" w:color="auto" w:val="clear"/>
-      </w:pPr>
-      <w:r>
-        <w:rPr>
-          <w:rFonts w:ascii="Consolas" w:cs="Consolas" w:eastAsia="Consolas" w:hAnsi="Consolas"/>
-          <w:sz w:val="17"/>
-          <w:szCs w:val="17"/>
-        </w:rPr>
-        <w:t xml:space="preserve">//* IM JOB-OUTPUT AN (grep).                                          *</w:t>
-      </w:r>
-    </w:p>
-    <w:p>
-      <w:pPr>
-        <w:pStyle w:val="Code"/>
-        <w:shd w:fill="F3F3F1" w:color="auto" w:val="clear"/>
-      </w:pPr>
-      <w:r>
-        <w:rPr>
-          <w:rFonts w:ascii="Consolas" w:cs="Consolas" w:eastAsia="Consolas" w:hAnsi="Consolas"/>
-          <w:sz w:val="17"/>
-          <w:szCs w:val="17"/>
-        </w:rPr>
-        <w:t xml:space="preserve">//*   - STEHT DORT EINE BIBLIOTHEK MIT CLCDRVR: SO LASSEN.            *</w:t>
-      </w:r>
-    </w:p>
-    <w:p>
-      <w:pPr>
-        <w:pStyle w:val="Code"/>
-        <w:shd w:fill="F3F3F1" w:color="auto" w:val="clear"/>
-      </w:pPr>
-      <w:r>
-        <w:rPr>
-          <w:rFonts w:ascii="Consolas" w:cs="Consolas" w:eastAsia="Consolas" w:hAnsi="Consolas"/>
-          <w:sz w:val="17"/>
-          <w:szCs w:val="17"/>
-        </w:rPr>
-        <w:t xml:space="preserve">//*   - STEHT DORT NONE ODER EINE FALSCHE BIBLIOTHEK: IM STEP         *</w:t>
-      </w:r>
-    </w:p>
-    <w:p>
-      <w:pPr>
-        <w:pStyle w:val="Code"/>
-        <w:shd w:fill="F3F3F1" w:color="auto" w:val="clear"/>
-      </w:pPr>
-      <w:r>
-        <w:rPr>
-          <w:rFonts w:ascii="Consolas" w:cs="Consolas" w:eastAsia="Consolas" w:hAnsi="Consolas"/>
-          <w:sz w:val="17"/>
-          <w:szCs w:val="17"/>
-        </w:rPr>
-        <w:t xml:space="preserve">//*     COMPILE DIE ZWEITE UND DRITTE ZEILE ERSETZEN DURCH            *</w:t>
-      </w:r>
-    </w:p>
-    <w:p>
-      <w:pPr>
-        <w:pStyle w:val="Code"/>
-        <w:shd w:fill="F3F3F1" w:color="auto" w:val="clear"/>
-      </w:pPr>
-      <w:r>
-        <w:rPr>
-          <w:rFonts w:ascii="Consolas" w:cs="Consolas" w:eastAsia="Consolas" w:hAnsi="Consolas"/>
-          <w:sz w:val="17"/>
-          <w:szCs w:val="17"/>
-        </w:rPr>
-        <w:t xml:space="preserve">//*       make cfg CMPLIB=CBC.SCLCCMP &amp;&amp; grep -n steplib cc.cfg &amp;&amp;    *</w:t>
-      </w:r>
-    </w:p>
-    <w:p>
-      <w:pPr>
-        <w:pStyle w:val="Code"/>
-        <w:shd w:fill="F3F3F1" w:color="auto" w:val="clear"/>
-      </w:pPr>
-      <w:r>
-        <w:rPr>
-          <w:rFonts w:ascii="Consolas" w:cs="Consolas" w:eastAsia="Consolas" w:hAnsi="Consolas"/>
-          <w:sz w:val="17"/>
-          <w:szCs w:val="17"/>
-        </w:rPr>
-        <w:t xml:space="preserve">//*       make clean all CFG=-F./cc.cfg                               *</w:t>
-      </w:r>
-    </w:p>
-    <w:p>
-      <w:pPr>
-        <w:pStyle w:val="Code"/>
-        <w:shd w:fill="F3F3F1" w:color="auto" w:val="clear"/>
-      </w:pPr>
-      <w:r>
-        <w:rPr>
-          <w:rFonts w:ascii="Consolas" w:cs="Consolas" w:eastAsia="Consolas" w:hAnsi="Consolas"/>
-          <w:sz w:val="17"/>
-          <w:szCs w:val="17"/>
-        </w:rPr>
-        <w:t xml:space="preserve">//*     (BIBLIOTHEK ANPASSEN; KANDIDATEN: tso "LISTCAT LEVEL(CBC)")   *</w:t>
+        <w:t xml:space="preserve">//* COMPILER-BIBLIOTHEK: DER TREIBER ccndrvr IST EIN EXTERNER LINK    *</w:t>
+      </w:r>
+    </w:p>
+    <w:p>
+      <w:pPr>
+        <w:pStyle w:val="Code"/>
+        <w:shd w:fill="F3F3F1" w:color="auto" w:val="clear"/>
+      </w:pPr>
+      <w:r>
+        <w:rPr>
+          <w:rFonts w:ascii="Consolas" w:cs="Consolas" w:eastAsia="Consolas" w:hAnsi="Consolas"/>
+          <w:sz w:val="17"/>
+          <w:szCs w:val="17"/>
+        </w:rPr>
+        <w:t xml:space="preserve">//* AUF DAS MVS-MODUL CCNDRVR IN CBC.SCCNCMP. WIRD ES NICHT IN        *</w:t>
+      </w:r>
+    </w:p>
+    <w:p>
+      <w:pPr>
+        <w:pStyle w:val="Code"/>
+        <w:shd w:fill="F3F3F1" w:color="auto" w:val="clear"/>
+      </w:pPr>
+      <w:r>
+        <w:rPr>
+          <w:rFonts w:ascii="Consolas" w:cs="Consolas" w:eastAsia="Consolas" w:hAnsi="Consolas"/>
+          <w:sz w:val="17"/>
+          <w:szCs w:val="17"/>
+        </w:rPr>
+        <w:t xml:space="preserve">//* STEPLIB/LNKLST/LPA GEFUNDEN: FSUM3221 (xlc) BZW. FSUM3224,        *</w:t>
+      </w:r>
+    </w:p>
+    <w:p>
+      <w:pPr>
+        <w:pStyle w:val="Code"/>
+        <w:shd w:fill="F3F3F1" w:color="auto" w:val="clear"/>
+      </w:pPr>
+      <w:r>
+        <w:rPr>
+          <w:rFonts w:ascii="Consolas" w:cs="Consolas" w:eastAsia="Consolas" w:hAnsi="Consolas"/>
+          <w:sz w:val="17"/>
+          <w:szCs w:val="17"/>
+        </w:rPr>
+        <w:t xml:space="preserve">//* SIGNAL 9, ABEND EC6 REASON ....C032 (xlclang). DIE SHELL-         *</w:t>
+      </w:r>
+    </w:p>
+    <w:p>
+      <w:pPr>
+        <w:pStyle w:val="Code"/>
+        <w:shd w:fill="F3F3F1" w:color="auto" w:val="clear"/>
+      </w:pPr>
+      <w:r>
+        <w:rPr>
+          <w:rFonts w:ascii="Consolas" w:cs="Consolas" w:eastAsia="Consolas" w:hAnsi="Consolas"/>
+          <w:sz w:val="17"/>
+          <w:szCs w:val="17"/>
+        </w:rPr>
+        <w:t xml:space="preserve">//* VARIABLE STEPLIB HILFT NICHT, DER WERT KOMMT NUR AUS DEM          *</w:t>
+      </w:r>
+    </w:p>
+    <w:p>
+      <w:pPr>
+        <w:pStyle w:val="Code"/>
+        <w:shd w:fill="F3F3F1" w:color="auto" w:val="clear"/>
+      </w:pPr>
+      <w:r>
+        <w:rPr>
+          <w:rFonts w:ascii="Consolas" w:cs="Consolas" w:eastAsia="Consolas" w:hAnsi="Consolas"/>
+          <w:sz w:val="17"/>
+          <w:szCs w:val="17"/>
+        </w:rPr>
+        <w:t xml:space="preserve">//* ATTRIBUT steplib DER COMPILER-KONFIGURATION, UND DORT STEHT       *</w:t>
+      </w:r>
+    </w:p>
+    <w:p>
+      <w:pPr>
+        <w:pStyle w:val="Code"/>
+        <w:shd w:fill="F3F3F1" w:color="auto" w:val="clear"/>
+      </w:pPr>
+      <w:r>
+        <w:rPr>
+          <w:rFonts w:ascii="Consolas" w:cs="Consolas" w:eastAsia="Consolas" w:hAnsi="Consolas"/>
+          <w:sz w:val="17"/>
+          <w:szCs w:val="17"/>
+        </w:rPr>
+        <w:t xml:space="preserve">//* IN DER GELIEFERTEN xlc.cfg NONE. DER STEP COMPILE ERZEUGT         *</w:t>
+      </w:r>
+    </w:p>
+    <w:p>
+      <w:pPr>
+        <w:pStyle w:val="Code"/>
+        <w:shd w:fill="F3F3F1" w:color="auto" w:val="clear"/>
+      </w:pPr>
+      <w:r>
+        <w:rPr>
+          <w:rFonts w:ascii="Consolas" w:cs="Consolas" w:eastAsia="Consolas" w:hAnsi="Consolas"/>
+          <w:sz w:val="17"/>
+          <w:szCs w:val="17"/>
+        </w:rPr>
+        <w:t xml:space="preserve">//* DESHALB MIT "make cfg" EINE KOPIE cc.cfg MIT steplib =            *</w:t>
+      </w:r>
+    </w:p>
+    <w:p>
+      <w:pPr>
+        <w:pStyle w:val="Code"/>
+        <w:shd w:fill="F3F3F1" w:color="auto" w:val="clear"/>
+      </w:pPr>
+      <w:r>
+        <w:rPr>
+          <w:rFonts w:ascii="Consolas" w:cs="Consolas" w:eastAsia="Consolas" w:hAnsi="Consolas"/>
+          <w:sz w:val="17"/>
+          <w:szCs w:val="17"/>
+        </w:rPr>
+        <w:t xml:space="preserve">//* CBC.SCCNCMP, ZEIGT DIE ZEILE IM JOB-OUTPUT (grep) UND             *</w:t>
+      </w:r>
+    </w:p>
+    <w:p>
+      <w:pPr>
+        <w:pStyle w:val="Code"/>
+        <w:shd w:fill="F3F3F1" w:color="auto" w:val="clear"/>
+      </w:pPr>
+      <w:r>
+        <w:rPr>
+          <w:rFonts w:ascii="Consolas" w:cs="Consolas" w:eastAsia="Consolas" w:hAnsi="Consolas"/>
+          <w:sz w:val="17"/>
+          <w:szCs w:val="17"/>
+        </w:rPr>
+        <w:t xml:space="preserve">//* UEBERSETZT MIT CFG=-F./cc.cfg.                                    *</w:t>
+      </w:r>
+    </w:p>
+    <w:p>
+      <w:pPr>
+        <w:pStyle w:val="Code"/>
+        <w:shd w:fill="F3F3F1" w:color="auto" w:val="clear"/>
+      </w:pPr>
+      <w:r>
+        <w:rPr>
+          <w:rFonts w:ascii="Consolas" w:cs="Consolas" w:eastAsia="Consolas" w:hAnsi="Consolas"/>
+          <w:sz w:val="17"/>
+          <w:szCs w:val="17"/>
+        </w:rPr>
+        <w:t xml:space="preserve">//*   - HEISST DIE BIBLIOTHEK ANDERS: make cfg CMPLIB=IHR.NAME        *</w:t>
+      </w:r>
+    </w:p>
+    <w:p>
+      <w:pPr>
+        <w:pStyle w:val="Code"/>
+        <w:shd w:fill="F3F3F1" w:color="auto" w:val="clear"/>
+      </w:pPr>
+      <w:r>
+        <w:rPr>
+          <w:rFonts w:ascii="Consolas" w:cs="Consolas" w:eastAsia="Consolas" w:hAnsi="Consolas"/>
+          <w:sz w:val="17"/>
+          <w:szCs w:val="17"/>
+        </w:rPr>
+        <w:t xml:space="preserve">//*     (KANDIDATEN: tso "LISTCAT LEVEL(CBC)")                        *</w:t>
+      </w:r>
+    </w:p>
+    <w:p>
+      <w:pPr>
+        <w:pStyle w:val="Code"/>
+        <w:shd w:fill="F3F3F1" w:color="auto" w:val="clear"/>
+      </w:pPr>
+      <w:r>
+        <w:rPr>
+          <w:rFonts w:ascii="Consolas" w:cs="Consolas" w:eastAsia="Consolas" w:hAnsi="Consolas"/>
+          <w:sz w:val="17"/>
+          <w:szCs w:val="17"/>
+        </w:rPr>
+        <w:t xml:space="preserve">//*   - STEHT CBC.SCCNCMP IN LNKLST/LPA, GENUEGT: make clean all      *</w:t>
       </w:r>
     </w:p>
     <w:p>
@@ -13369,21 +13338,21 @@
           <w:sz w:val="17"/>
           <w:szCs w:val="17"/>
         </w:rPr>
-        <w:t xml:space="preserve"> grep -n steplib /usr/lpp/cbclib/xlclang/etc/xlclang.cfg &amp;&amp;</w:t>
-      </w:r>
-    </w:p>
-    <w:p>
-      <w:pPr>
-        <w:pStyle w:val="Code"/>
-        <w:shd w:fill="F3F3F1" w:color="auto" w:val="clear"/>
-      </w:pPr>
-      <w:r>
-        <w:rPr>
-          <w:rFonts w:ascii="Consolas" w:cs="Consolas" w:eastAsia="Consolas" w:hAnsi="Consolas"/>
-          <w:sz w:val="17"/>
-          <w:szCs w:val="17"/>
-        </w:rPr>
-        <w:t xml:space="preserve"> make clean all</w:t>
+        <w:t xml:space="preserve"> make cfg &amp;&amp; grep -n steplib cc.cfg &amp;&amp;</w:t>
+      </w:r>
+    </w:p>
+    <w:p>
+      <w:pPr>
+        <w:pStyle w:val="Code"/>
+        <w:shd w:fill="F3F3F1" w:color="auto" w:val="clear"/>
+      </w:pPr>
+      <w:r>
+        <w:rPr>
+          <w:rFonts w:ascii="Consolas" w:cs="Consolas" w:eastAsia="Consolas" w:hAnsi="Consolas"/>
+          <w:sz w:val="17"/>
+          <w:szCs w:val="17"/>
+        </w:rPr>
+        <w:t xml:space="preserve"> make clean all CFG=-F./cc.cfg</w:t>
       </w:r>
     </w:p>
     <w:p>

</xml_diff>

<commit_message>
make run: Umgebungsvariable ueber env setzen
z/OS make startet Kommandos ohne Shell-Metazeichen direkt per spawn
und meldet fuer _BPX_SHAREAS=YES "EDC5129I No such file or directory".

Co-Authored-By: Claude Fable 5.1 <noreply@anthropic.com>
</commit_message>
<xml_diff>
--- a/USSDEMO-Dokumentation.docx
+++ b/USSDEMO-Dokumentation.docx
@@ -5028,7 +5028,40 @@
         <w:t xml:space="preserve">_BPX_SHAREAS=YES</w:t>
       </w:r>
       <w:r>
-        <w:t xml:space="preserve"> und läuft nur, wenn </w:t>
+        <w:t xml:space="preserve"> (im Makefile über </w:t>
+      </w:r>
+      <w:r>
+        <w:rPr>
+          <w:rFonts w:ascii="Consolas" w:cs="Consolas" w:eastAsia="Consolas" w:hAnsi="Consolas"/>
+          <w:sz w:val="20"/>
+          <w:szCs w:val="20"/>
+        </w:rPr>
+        <w:t xml:space="preserve">env</w:t>
+      </w:r>
+      <w:r>
+        <w:t xml:space="preserve">, weil z/OS-</w:t>
+      </w:r>
+      <w:r>
+        <w:rPr>
+          <w:rFonts w:ascii="Consolas" w:cs="Consolas" w:eastAsia="Consolas" w:hAnsi="Consolas"/>
+          <w:sz w:val="20"/>
+          <w:szCs w:val="20"/>
+        </w:rPr>
+        <w:t xml:space="preserve">make</w:t>
+      </w:r>
+      <w:r>
+        <w:t xml:space="preserve"> Kommandos ohne Shell-Metazeichen direkt startet und </w:t>
+      </w:r>
+      <w:r>
+        <w:rPr>
+          <w:rFonts w:ascii="Consolas" w:cs="Consolas" w:eastAsia="Consolas" w:hAnsi="Consolas"/>
+          <w:sz w:val="20"/>
+          <w:szCs w:val="20"/>
+        </w:rPr>
+        <w:t xml:space="preserve">VAR=WERT</w:t>
+      </w:r>
+      <w:r>
+        <w:t xml:space="preserve"> sonst als Programmname liest) und läuft nur, wenn </w:t>
       </w:r>
       <w:r>
         <w:rPr>
@@ -12598,21 +12631,49 @@
           <w:sz w:val="17"/>
           <w:szCs w:val="17"/>
         </w:rPr>
-        <w:t xml:space="preserve"># Elternprozesses (wird ausserhalb von z/OS ignoriert).</w:t>
-      </w:r>
-    </w:p>
-    <w:p>
-      <w:pPr>
-        <w:pStyle w:val="Code"/>
-        <w:shd w:fill="F3F3F1" w:color="auto" w:val="clear"/>
-      </w:pPr>
-      <w:r>
-        <w:rPr>
-          <w:rFonts w:ascii="Consolas" w:cs="Consolas" w:eastAsia="Consolas" w:hAnsi="Consolas"/>
-          <w:sz w:val="17"/>
-          <w:szCs w:val="17"/>
-        </w:rPr>
-        <w:t xml:space="preserve">run: $(PROG) ; _BPX_SHAREAS=YES ./$(PROG)</w:t>
+        <w:t xml:space="preserve"># Elternprozesses (wird ausserhalb von z/OS ignoriert). "env" ist</w:t>
+      </w:r>
+    </w:p>
+    <w:p>
+      <w:pPr>
+        <w:pStyle w:val="Code"/>
+        <w:shd w:fill="F3F3F1" w:color="auto" w:val="clear"/>
+      </w:pPr>
+      <w:r>
+        <w:rPr>
+          <w:rFonts w:ascii="Consolas" w:cs="Consolas" w:eastAsia="Consolas" w:hAnsi="Consolas"/>
+          <w:sz w:val="17"/>
+          <w:szCs w:val="17"/>
+        </w:rPr>
+        <w:t xml:space="preserve"># noetig: z/OS make startet Kommandos ohne Shell-Metazeichen direkt</w:t>
+      </w:r>
+    </w:p>
+    <w:p>
+      <w:pPr>
+        <w:pStyle w:val="Code"/>
+        <w:shd w:fill="F3F3F1" w:color="auto" w:val="clear"/>
+      </w:pPr>
+      <w:r>
+        <w:rPr>
+          <w:rFonts w:ascii="Consolas" w:cs="Consolas" w:eastAsia="Consolas" w:hAnsi="Consolas"/>
+          <w:sz w:val="17"/>
+          <w:szCs w:val="17"/>
+        </w:rPr>
+        <w:t xml:space="preserve"># und hielte VAR=WERT sonst fuer einen Programmnamen (EDC5129I).</w:t>
+      </w:r>
+    </w:p>
+    <w:p>
+      <w:pPr>
+        <w:pStyle w:val="Code"/>
+        <w:shd w:fill="F3F3F1" w:color="auto" w:val="clear"/>
+      </w:pPr>
+      <w:r>
+        <w:rPr>
+          <w:rFonts w:ascii="Consolas" w:cs="Consolas" w:eastAsia="Consolas" w:hAnsi="Consolas"/>
+          <w:sz w:val="17"/>
+          <w:szCs w:val="17"/>
+        </w:rPr>
+        <w:t xml:space="preserve">run: $(PROG) ; env _BPX_SHAREAS=YES ./$(PROG)</w:t>
       </w:r>
     </w:p>
     <w:p>

</xml_diff>

<commit_message>
Teststand: Lauf auf z/OS 2.4 bestaetigt
Beispielausgabe durch den echten z/OS-Lauf ersetzt (xlc, cc.cfg,
_BPX_SHAREAS=YES, beide Kinder exit=0, Summe OK). README und
Dokumentation (Teststand, Mutex-Statistik, Kapitel 8) nachgezogen.

Co-Authored-By: Claude Fable 5.1 <noreply@anthropic.com>
</commit_message>
<xml_diff>
--- a/USSDEMO-Dokumentation.docx
+++ b/USSDEMO-Dokumentation.docx
@@ -469,7 +469,81 @@
         <w:spacing w:after="120"/>
       </w:pPr>
       <w:r>
-        <w:t xml:space="preserve">Das Programm wurde unter Linux (WSL, Ubuntu, gcc 13.3) mit </w:t>
+        <w:t xml:space="preserve">Das Programm wurde auf z/OS 2.4 mit </w:t>
+      </w:r>
+      <w:r>
+        <w:rPr>
+          <w:rFonts w:ascii="Consolas" w:cs="Consolas" w:eastAsia="Consolas" w:hAnsi="Consolas"/>
+          <w:sz w:val="20"/>
+          <w:szCs w:val="20"/>
+        </w:rPr>
+        <w:t xml:space="preserve">xlc</w:t>
+      </w:r>
+      <w:r>
+        <w:t xml:space="preserve"> (z/OS XL C/C++, lokale Konfiguration </w:t>
+      </w:r>
+      <w:r>
+        <w:rPr>
+          <w:rFonts w:ascii="Consolas" w:cs="Consolas" w:eastAsia="Consolas" w:hAnsi="Consolas"/>
+          <w:sz w:val="20"/>
+          <w:szCs w:val="20"/>
+        </w:rPr>
+        <w:t xml:space="preserve">cc.cfg</w:t>
+      </w:r>
+      <w:r>
+        <w:t xml:space="preserve">) übersetzt und in der z/OS UNIX Shell mit </w:t>
+      </w:r>
+      <w:r>
+        <w:rPr>
+          <w:rFonts w:ascii="Consolas" w:cs="Consolas" w:eastAsia="Consolas" w:hAnsi="Consolas"/>
+          <w:sz w:val="20"/>
+          <w:szCs w:val="20"/>
+        </w:rPr>
+        <w:t xml:space="preserve">_BPX_SHAREAS=YES</w:t>
+      </w:r>
+      <w:r>
+        <w:t xml:space="preserve"> ausgeführt. Beide Kindprozesse endeten mit Exit-Code 0, die Summe stimmte (Kapitel 8 zeigt diesen Lauf). Damit sind der </w:t>
+      </w:r>
+      <w:r>
+        <w:rPr>
+          <w:rFonts w:ascii="Consolas" w:cs="Consolas" w:eastAsia="Consolas" w:hAnsi="Consolas"/>
+          <w:sz w:val="20"/>
+          <w:szCs w:val="20"/>
+        </w:rPr>
+        <w:t xml:space="preserve">spawnp()</w:t>
+      </w:r>
+      <w:r>
+        <w:t xml:space="preserve">-Zweig mit </w:t>
+      </w:r>
+      <w:r>
+        <w:rPr>
+          <w:rFonts w:ascii="Consolas" w:cs="Consolas" w:eastAsia="Consolas" w:hAnsi="Consolas"/>
+          <w:sz w:val="20"/>
+          <w:szCs w:val="20"/>
+        </w:rPr>
+        <w:t xml:space="preserve">fd_map</w:t>
+      </w:r>
+      <w:r>
+        <w:t xml:space="preserve"> und </w:t>
+      </w:r>
+      <w:r>
+        <w:rPr>
+          <w:rFonts w:ascii="Consolas" w:cs="Consolas" w:eastAsia="Consolas" w:hAnsi="Consolas"/>
+          <w:sz w:val="20"/>
+          <w:szCs w:val="20"/>
+        </w:rPr>
+        <w:t xml:space="preserve">struct inheritance</w:t>
+      </w:r>
+      <w:r>
+        <w:t xml:space="preserve">, die Feature-Test-Makros und das Makefile auf z/OS bestätigt. Das JCL wurde noch nicht vollständig durchlaufen.</w:t>
+      </w:r>
+    </w:p>
+    <w:p>
+      <w:pPr>
+        <w:spacing w:after="120"/>
+      </w:pPr>
+      <w:r>
+        <w:t xml:space="preserve">Unter Linux (WSL, Ubuntu, gcc 13.3) übersetzt das Programm mit </w:t>
       </w:r>
       <w:r>
         <w:rPr>
@@ -480,7 +554,7 @@
         <w:t xml:space="preserve">-Wall -Wextra</w:t>
       </w:r>
       <w:r>
-        <w:t xml:space="preserve"> ohne Warnungen übersetzt und mehrfach ausgeführt. Die Summe stimmte in jedem Lauf, ThreadSanitizer meldete keine Data Races. Auf Nicht-z/OS-Systemen verwendet das Programm ersatzweise </w:t>
+        <w:t xml:space="preserve"> ohne Warnungen; die Summe stimmte in jedem Lauf, ThreadSanitizer meldete keine Data Races. Auf Nicht-z/OS-Systemen verwendet das Programm ersatzweise </w:t>
       </w:r>
       <w:r>
         <w:rPr>
@@ -503,58 +577,6 @@
       </w:r>
       <w:r>
         <w:t xml:space="preserve">.</w:t>
-      </w:r>
-    </w:p>
-    <w:p>
-      <w:pPr>
-        <w:spacing w:after="120"/>
-      </w:pPr>
-      <w:r>
-        <w:t xml:space="preserve">Der z/OS-spezifische Teil ist nicht auf einem z/OS-System getestet: der </w:t>
-      </w:r>
-      <w:r>
-        <w:rPr>
-          <w:rFonts w:ascii="Consolas" w:cs="Consolas" w:eastAsia="Consolas" w:hAnsi="Consolas"/>
-          <w:sz w:val="20"/>
-          <w:szCs w:val="20"/>
-        </w:rPr>
-        <w:t xml:space="preserve">spawnp()</w:t>
-      </w:r>
-      <w:r>
-        <w:t xml:space="preserve">-Zweig mit </w:t>
-      </w:r>
-      <w:r>
-        <w:rPr>
-          <w:rFonts w:ascii="Consolas" w:cs="Consolas" w:eastAsia="Consolas" w:hAnsi="Consolas"/>
-          <w:sz w:val="20"/>
-          <w:szCs w:val="20"/>
-        </w:rPr>
-        <w:t xml:space="preserve">fd_map</w:t>
-      </w:r>
-      <w:r>
-        <w:t xml:space="preserve"> und </w:t>
-      </w:r>
-      <w:r>
-        <w:rPr>
-          <w:rFonts w:ascii="Consolas" w:cs="Consolas" w:eastAsia="Consolas" w:hAnsi="Consolas"/>
-          <w:sz w:val="20"/>
-          <w:szCs w:val="20"/>
-        </w:rPr>
-        <w:t xml:space="preserve">struct inheritance</w:t>
-      </w:r>
-      <w:r>
-        <w:t xml:space="preserve">, die Feature-Test-Makros, das Makefile mit </w:t>
-      </w:r>
-      <w:r>
-        <w:rPr>
-          <w:rFonts w:ascii="Consolas" w:cs="Consolas" w:eastAsia="Consolas" w:hAnsi="Consolas"/>
-          <w:sz w:val="20"/>
-          <w:szCs w:val="20"/>
-        </w:rPr>
-        <w:t xml:space="preserve">xlc</w:t>
-      </w:r>
-      <w:r>
-        <w:t xml:space="preserve"> und das JCL. Beim ersten Übersetzen auf z/OS ist deshalb mit kleinen Anpassungen zu rechnen, zum Beispiel bei den Makros oder Compiler-Optionen.</w:t>
       </w:r>
     </w:p>
     <w:p>
@@ -3521,7 +3543,18 @@
         <w:t xml:space="preserve">main()</w:t>
       </w:r>
       <w:r>
-        <w:t xml:space="preserve"> gibt die Gesamtstatistik aus. Die Zahl schwankt von Lauf zu Lauf stark, in den Tests zwischen 0 und etwa 2300 von 60 010 Updates. Der kritische Abschnitt ist sehr kurz, und die Threads starten nacheinander.</w:t>
+        <w:t xml:space="preserve"> gibt die Gesamtstatistik aus. Die Zahl hängt stark vom System ab. Unter Linux lag sie zwischen 0 und etwa 2300 von 60 010 Updates: Der kritische Abschnitt ist sehr kurz, und ein Thread, der den Mutex gerade freigegeben hat, bekommt ihn beim nächsten Versuch meist sofort wieder. Auf z/OS lag sie bei 96,8 %, zwei Rechen-Threads mussten bei jedem einzelnen Update warten. Das spricht dafür, dass die z/OS-Implementierung den Mutex bei der Freigabe direkt an einen wartenden Thread übergibt. Der freigebende Thread findet ihn beim nächsten </w:t>
+      </w:r>
+      <w:r>
+        <w:rPr>
+          <w:rFonts w:ascii="Consolas" w:cs="Consolas" w:eastAsia="Consolas" w:hAnsi="Consolas"/>
+          <w:sz w:val="20"/>
+          <w:szCs w:val="20"/>
+        </w:rPr>
+        <w:t xml:space="preserve">trylock</w:t>
+      </w:r>
+      <w:r>
+        <w:t xml:space="preserve"> dann belegt. Die Statistik misst also nicht nur Gleichzeitigkeit, sondern auch die Vergabestrategie des Systems.</w:t>
       </w:r>
     </w:p>
     <w:p>
@@ -5393,21 +5426,79 @@
         <w:spacing w:after="120"/>
       </w:pPr>
       <w:r>
-        <w:t xml:space="preserve">Ausgabe eines Laufs unter Linux. Die Reihenfolge der Thread-Zeilen und die Zahl der Wartefälle ändern sich von Lauf zu Lauf, Summe und Zahl der Updates nicht.</w:t>
-      </w:r>
-    </w:p>
-    <w:p>
-      <w:pPr>
-        <w:pStyle w:val="Code"/>
-        <w:shd w:fill="F3F3F1" w:color="auto" w:val="clear"/>
-      </w:pPr>
-      <w:r>
-        <w:rPr>
-          <w:rFonts w:ascii="Consolas" w:cs="Consolas" w:eastAsia="Consolas" w:hAnsi="Consolas"/>
-          <w:sz w:val="17"/>
-          <w:szCs w:val="17"/>
-        </w:rPr>
-        <w:t xml:space="preserve">Elternprozess pid 1790306: fork-Kind 1790307, spawn-Kind 1790308</w:t>
+        <w:t xml:space="preserve">Ausgabe eines Laufs auf z/OS 2.4 in der z/OS UNIX Shell mit </w:t>
+      </w:r>
+      <w:r>
+        <w:rPr>
+          <w:rFonts w:ascii="Consolas" w:cs="Consolas" w:eastAsia="Consolas" w:hAnsi="Consolas"/>
+          <w:sz w:val="20"/>
+          <w:szCs w:val="20"/>
+        </w:rPr>
+        <w:t xml:space="preserve">_BPX_SHAREAS=YES</w:t>
+      </w:r>
+      <w:r>
+        <w:t xml:space="preserve">. Die Reihenfolge der Thread-Zeilen und die Zahl der Wartefälle ändern sich von Lauf zu Lauf, Summe und Zahl der Updates nicht. Die PIDs zeigen, dass das </w:t>
+      </w:r>
+      <w:r>
+        <w:rPr>
+          <w:rFonts w:ascii="Consolas" w:cs="Consolas" w:eastAsia="Consolas" w:hAnsi="Consolas"/>
+          <w:sz w:val="20"/>
+          <w:szCs w:val="20"/>
+        </w:rPr>
+        <w:t xml:space="preserve">fork()</w:t>
+      </w:r>
+      <w:r>
+        <w:t xml:space="preserve">-Kind und das </w:t>
+      </w:r>
+      <w:r>
+        <w:rPr>
+          <w:rFonts w:ascii="Consolas" w:cs="Consolas" w:eastAsia="Consolas" w:hAnsi="Consolas"/>
+          <w:sz w:val="20"/>
+          <w:szCs w:val="20"/>
+        </w:rPr>
+        <w:t xml:space="preserve">spawn()</w:t>
+      </w:r>
+      <w:r>
+        <w:t xml:space="preserve">-Kind eigene Prozesse sind, auch wenn das </w:t>
+      </w:r>
+      <w:r>
+        <w:rPr>
+          <w:rFonts w:ascii="Consolas" w:cs="Consolas" w:eastAsia="Consolas" w:hAnsi="Consolas"/>
+          <w:sz w:val="20"/>
+          <w:szCs w:val="20"/>
+        </w:rPr>
+        <w:t xml:space="preserve">spawn()</w:t>
+      </w:r>
+      <w:r>
+        <w:t xml:space="preserve">-Kind im Adressraum des Elternprozesses läuft.</w:t>
+      </w:r>
+    </w:p>
+    <w:p>
+      <w:pPr>
+        <w:pStyle w:val="Code"/>
+        <w:shd w:fill="F3F3F1" w:color="auto" w:val="clear"/>
+      </w:pPr>
+      <w:r>
+        <w:rPr>
+          <w:rFonts w:ascii="Consolas" w:cs="Consolas" w:eastAsia="Consolas" w:hAnsi="Consolas"/>
+          <w:sz w:val="17"/>
+          <w:szCs w:val="17"/>
+        </w:rPr>
+        <w:t xml:space="preserve">UMAS:/u/UMAS/uss-demo: &gt;env _BPX_SHAREAS=YES ./ussdemo</w:t>
+      </w:r>
+    </w:p>
+    <w:p>
+      <w:pPr>
+        <w:pStyle w:val="Code"/>
+        <w:shd w:fill="F3F3F1" w:color="auto" w:val="clear"/>
+      </w:pPr>
+      <w:r>
+        <w:rPr>
+          <w:rFonts w:ascii="Consolas" w:cs="Consolas" w:eastAsia="Consolas" w:hAnsi="Consolas"/>
+          <w:sz w:val="17"/>
+          <w:szCs w:val="17"/>
+        </w:rPr>
+        <w:t xml:space="preserve">Elternprozess pid 83952453: fork-Kind 66415, spawn-Kind 66382</w:t>
       </w:r>
     </w:p>
     <w:p>
@@ -5491,21 +5582,7 @@
           <w:sz w:val="17"/>
           <w:szCs w:val="17"/>
         </w:rPr>
-        <w:t xml:space="preserve">[reader fork ] Pipe zu, 2 mal auf Mutex gewartet</w:t>
-      </w:r>
-    </w:p>
-    <w:p>
-      <w:pPr>
-        <w:pStyle w:val="Code"/>
-        <w:shd w:fill="F3F3F1" w:color="auto" w:val="clear"/>
-      </w:pPr>
-      <w:r>
-        <w:rPr>
-          <w:rFonts w:ascii="Consolas" w:cs="Consolas" w:eastAsia="Consolas" w:hAnsi="Consolas"/>
-          <w:sz w:val="17"/>
-          <w:szCs w:val="17"/>
-        </w:rPr>
-        <w:t xml:space="preserve">[compute 2   ] 20000 Werte, 4 mal auf Mutex gewartet</w:t>
+        <w:t xml:space="preserve">[reader fork ] Pipe zu, 5 mal auf Mutex gewartet</w:t>
       </w:r>
     </w:p>
     <w:p>
@@ -5589,63 +5666,77 @@
           <w:sz w:val="17"/>
           <w:szCs w:val="17"/>
         </w:rPr>
-        <w:t xml:space="preserve">[reader spawn] Pipe zu, 2 mal auf Mutex gewartet</w:t>
-      </w:r>
-    </w:p>
-    <w:p>
-      <w:pPr>
-        <w:pStyle w:val="Code"/>
-        <w:shd w:fill="F3F3F1" w:color="auto" w:val="clear"/>
-      </w:pPr>
-      <w:r>
-        <w:rPr>
-          <w:rFonts w:ascii="Consolas" w:cs="Consolas" w:eastAsia="Consolas" w:hAnsi="Consolas"/>
-          <w:sz w:val="17"/>
-          <w:szCs w:val="17"/>
-        </w:rPr>
-        <w:t xml:space="preserve">[compute 1   ] 20000 Werte, 709 mal auf Mutex gewartet</w:t>
-      </w:r>
-    </w:p>
-    <w:p>
-      <w:pPr>
-        <w:pStyle w:val="Code"/>
-        <w:shd w:fill="F3F3F1" w:color="auto" w:val="clear"/>
-      </w:pPr>
-      <w:r>
-        <w:rPr>
-          <w:rFonts w:ascii="Consolas" w:cs="Consolas" w:eastAsia="Consolas" w:hAnsi="Consolas"/>
-          <w:sz w:val="17"/>
-          <w:szCs w:val="17"/>
-        </w:rPr>
-        <w:t xml:space="preserve">[compute 3   ] 20000 Werte, 891 mal auf Mutex gewartet</w:t>
-      </w:r>
-    </w:p>
-    <w:p>
-      <w:pPr>
-        <w:pStyle w:val="Code"/>
-        <w:shd w:fill="F3F3F1" w:color="auto" w:val="clear"/>
-      </w:pPr>
-      <w:r>
-        <w:rPr>
-          <w:rFonts w:ascii="Consolas" w:cs="Consolas" w:eastAsia="Consolas" w:hAnsi="Consolas"/>
-          <w:sz w:val="17"/>
-          <w:szCs w:val="17"/>
-        </w:rPr>
-        <w:t xml:space="preserve">Kindprozess fork  (pid 1790307) beendet, exit=0</w:t>
-      </w:r>
-    </w:p>
-    <w:p>
-      <w:pPr>
-        <w:pStyle w:val="Code"/>
-        <w:shd w:fill="F3F3F1" w:color="auto" w:val="clear"/>
-      </w:pPr>
-      <w:r>
-        <w:rPr>
-          <w:rFonts w:ascii="Consolas" w:cs="Consolas" w:eastAsia="Consolas" w:hAnsi="Consolas"/>
-          <w:sz w:val="17"/>
-          <w:szCs w:val="17"/>
-        </w:rPr>
-        <w:t xml:space="preserve">Kindprozess spawn (pid 1790308) beendet, exit=0</w:t>
+        <w:t xml:space="preserve">[reader spawn] Pipe zu, 5 mal auf Mutex gewartet</w:t>
+      </w:r>
+    </w:p>
+    <w:p>
+      <w:pPr>
+        <w:pStyle w:val="Code"/>
+        <w:shd w:fill="F3F3F1" w:color="auto" w:val="clear"/>
+      </w:pPr>
+      <w:r>
+        <w:rPr>
+          <w:rFonts w:ascii="Consolas" w:cs="Consolas" w:eastAsia="Consolas" w:hAnsi="Consolas"/>
+          <w:sz w:val="17"/>
+          <w:szCs w:val="17"/>
+        </w:rPr>
+        <w:t xml:space="preserve">[compute 2   ] 20000 Werte, 20000 mal auf Mutex gewartet</w:t>
+      </w:r>
+    </w:p>
+    <w:p>
+      <w:pPr>
+        <w:pStyle w:val="Code"/>
+        <w:shd w:fill="F3F3F1" w:color="auto" w:val="clear"/>
+      </w:pPr>
+      <w:r>
+        <w:rPr>
+          <w:rFonts w:ascii="Consolas" w:cs="Consolas" w:eastAsia="Consolas" w:hAnsi="Consolas"/>
+          <w:sz w:val="17"/>
+          <w:szCs w:val="17"/>
+        </w:rPr>
+        <w:t xml:space="preserve">[compute 3   ] 20000 Werte, 20000 mal auf Mutex gewartet</w:t>
+      </w:r>
+    </w:p>
+    <w:p>
+      <w:pPr>
+        <w:pStyle w:val="Code"/>
+        <w:shd w:fill="F3F3F1" w:color="auto" w:val="clear"/>
+      </w:pPr>
+      <w:r>
+        <w:rPr>
+          <w:rFonts w:ascii="Consolas" w:cs="Consolas" w:eastAsia="Consolas" w:hAnsi="Consolas"/>
+          <w:sz w:val="17"/>
+          <w:szCs w:val="17"/>
+        </w:rPr>
+        <w:t xml:space="preserve">[compute 1   ] 20000 Werte, 18092 mal auf Mutex gewartet</w:t>
+      </w:r>
+    </w:p>
+    <w:p>
+      <w:pPr>
+        <w:pStyle w:val="Code"/>
+        <w:shd w:fill="F3F3F1" w:color="auto" w:val="clear"/>
+      </w:pPr>
+      <w:r>
+        <w:rPr>
+          <w:rFonts w:ascii="Consolas" w:cs="Consolas" w:eastAsia="Consolas" w:hAnsi="Consolas"/>
+          <w:sz w:val="17"/>
+          <w:szCs w:val="17"/>
+        </w:rPr>
+        <w:t xml:space="preserve">Kindprozess fork  (pid 66415) beendet, exit=0</w:t>
+      </w:r>
+    </w:p>
+    <w:p>
+      <w:pPr>
+        <w:pStyle w:val="Code"/>
+        <w:shd w:fill="F3F3F1" w:color="auto" w:val="clear"/>
+      </w:pPr>
+      <w:r>
+        <w:rPr>
+          <w:rFonts w:ascii="Consolas" w:cs="Consolas" w:eastAsia="Consolas" w:hAnsi="Consolas"/>
+          <w:sz w:val="17"/>
+          <w:szCs w:val="17"/>
+        </w:rPr>
+        <w:t xml:space="preserve">Kindprozess spawn (pid 66382) beendet, exit=0</w:t>
       </w:r>
     </w:p>
     <w:p>
@@ -5673,7 +5764,7 @@
           <w:sz w:val="17"/>
           <w:szCs w:val="17"/>
         </w:rPr>
-        <w:t xml:space="preserve">Mutex-Statistik: 1608 von 60010 Updates warteten (2.7 %)</w:t>
+        <w:t xml:space="preserve">Mutex-Statistik: 58102 von 60010 Updates warteten (96.8 %)</w:t>
       </w:r>
     </w:p>
     <w:p>

</xml_diff>

<commit_message>
Teststand: JCL-Lauf auf z/OS bestaetigt
Co-Authored-By: Claude Fable 5.1 <noreply@anthropic.com>
</commit_message>
<xml_diff>
--- a/USSDEMO-Dokumentation.docx
+++ b/USSDEMO-Dokumentation.docx
@@ -502,7 +502,62 @@
         <w:t xml:space="preserve">_BPX_SHAREAS=YES</w:t>
       </w:r>
       <w:r>
-        <w:t xml:space="preserve"> ausgeführt. Beide Kindprozesse endeten mit Exit-Code 0, die Summe stimmte (Kapitel 8 zeigt diesen Lauf). Damit sind der </w:t>
+        <w:t xml:space="preserve"> ausgeführt. Beide Kindprozesse endeten mit Exit-Code 0, die Summe stimmte (Kapitel 8 zeigt diesen Lauf). Der Batch-Weg über </w:t>
+      </w:r>
+      <w:r>
+        <w:rPr>
+          <w:rFonts w:ascii="Consolas" w:cs="Consolas" w:eastAsia="Consolas" w:hAnsi="Consolas"/>
+          <w:sz w:val="20"/>
+          <w:szCs w:val="20"/>
+        </w:rPr>
+        <w:t xml:space="preserve">USSDEMO.jcl</w:t>
+      </w:r>
+      <w:r>
+        <w:t xml:space="preserve"> lief ebenfalls durch: Step </w:t>
+      </w:r>
+      <w:r>
+        <w:rPr>
+          <w:rFonts w:ascii="Consolas" w:cs="Consolas" w:eastAsia="Consolas" w:hAnsi="Consolas"/>
+          <w:sz w:val="20"/>
+          <w:szCs w:val="20"/>
+        </w:rPr>
+        <w:t xml:space="preserve">COMPILE</w:t>
+      </w:r>
+      <w:r>
+        <w:t xml:space="preserve"> mit </w:t>
+      </w:r>
+      <w:r>
+        <w:rPr>
+          <w:rFonts w:ascii="Consolas" w:cs="Consolas" w:eastAsia="Consolas" w:hAnsi="Consolas"/>
+          <w:sz w:val="20"/>
+          <w:szCs w:val="20"/>
+        </w:rPr>
+        <w:t xml:space="preserve">make cfg</w:t>
+      </w:r>
+      <w:r>
+        <w:t xml:space="preserve"> und </w:t>
+      </w:r>
+      <w:r>
+        <w:rPr>
+          <w:rFonts w:ascii="Consolas" w:cs="Consolas" w:eastAsia="Consolas" w:hAnsi="Consolas"/>
+          <w:sz w:val="20"/>
+          <w:szCs w:val="20"/>
+        </w:rPr>
+        <w:t xml:space="preserve">xlc</w:t>
+      </w:r>
+      <w:r>
+        <w:t xml:space="preserve">, Step </w:t>
+      </w:r>
+      <w:r>
+        <w:rPr>
+          <w:rFonts w:ascii="Consolas" w:cs="Consolas" w:eastAsia="Consolas" w:hAnsi="Consolas"/>
+          <w:sz w:val="20"/>
+          <w:szCs w:val="20"/>
+        </w:rPr>
+        <w:t xml:space="preserve">RUN</w:t>
+      </w:r>
+      <w:r>
+        <w:t xml:space="preserve"> mit derselben korrekten Ausgabe. Damit sind der </w:t>
       </w:r>
       <w:r>
         <w:rPr>
@@ -535,7 +590,7 @@
         <w:t xml:space="preserve">struct inheritance</w:t>
       </w:r>
       <w:r>
-        <w:t xml:space="preserve">, die Feature-Test-Makros und das Makefile auf z/OS bestätigt. Das JCL wurde noch nicht vollständig durchlaufen.</w:t>
+        <w:t xml:space="preserve">, die Feature-Test-Makros, das Makefile und das JCL auf z/OS bestätigt.</w:t>
       </w:r>
     </w:p>
     <w:p>

</xml_diff>